<commit_message>
wip: último avance de hoy, diagrama de procesos v.1.0 + docs: actualización de historial de usuario.
</commit_message>
<xml_diff>
--- a/01-requisitos/05-historia-de-usuario/historial-de-usuario.docx
+++ b/01-requisitos/05-historia-de-usuario/historial-de-usuario.docx
@@ -1056,15 +1056,7 @@
           <w:sz w:val="26"/>
           <w:szCs w:val="26"/>
         </w:rPr>
-        <w:t xml:space="preserve">registrar </w:t>
-      </w:r>
-      <w:r>
-        <w:rPr>
-          <w:rFonts w:ascii="Arial" w:hAnsi="Arial" w:cs="Arial"/>
-          <w:sz w:val="26"/>
-          <w:szCs w:val="26"/>
-        </w:rPr>
-        <w:t>ventas de papelería o ropa,</w:t>
+        <w:t>registrar ventas de papelería o ropa,</w:t>
       </w:r>
     </w:p>
     <w:p>
@@ -1093,93 +1085,330 @@
           <w:sz w:val="26"/>
           <w:szCs w:val="26"/>
         </w:rPr>
-        <w:t xml:space="preserve">mantener un historial </w:t>
-      </w:r>
-      <w:r>
-        <w:rPr>
-          <w:rFonts w:ascii="Arial" w:hAnsi="Arial" w:cs="Arial"/>
-          <w:sz w:val="26"/>
-          <w:szCs w:val="26"/>
-        </w:rPr>
-        <w:t>de ventas y facilitar los movimientos en el día de productos vendidos.</w:t>
-      </w:r>
-    </w:p>
-    <w:p>
-      <w:pPr>
-        <w:spacing w:after="0"/>
-        <w:jc w:val="both"/>
-        <w:rPr>
-          <w:rFonts w:ascii="Arial" w:hAnsi="Arial" w:cs="Arial"/>
-          <w:sz w:val="26"/>
-          <w:szCs w:val="26"/>
-        </w:rPr>
-      </w:pPr>
-    </w:p>
-    <w:p>
-      <w:pPr>
-        <w:spacing w:after="0"/>
-        <w:jc w:val="both"/>
-        <w:rPr>
-          <w:rFonts w:ascii="Arial" w:hAnsi="Arial" w:cs="Arial"/>
-          <w:sz w:val="26"/>
-          <w:szCs w:val="26"/>
-        </w:rPr>
-      </w:pPr>
-    </w:p>
-    <w:p>
-      <w:pPr>
-        <w:spacing w:after="0"/>
-        <w:jc w:val="both"/>
-        <w:rPr>
-          <w:rFonts w:ascii="Arial" w:hAnsi="Arial" w:cs="Arial"/>
-          <w:sz w:val="26"/>
-          <w:szCs w:val="26"/>
-        </w:rPr>
-      </w:pPr>
-    </w:p>
-    <w:p>
-      <w:pPr>
-        <w:spacing w:after="0"/>
-        <w:jc w:val="both"/>
-        <w:rPr>
-          <w:rFonts w:ascii="Arial" w:hAnsi="Arial" w:cs="Arial"/>
-          <w:sz w:val="26"/>
-          <w:szCs w:val="26"/>
-        </w:rPr>
-      </w:pPr>
-    </w:p>
-    <w:p>
-      <w:pPr>
-        <w:spacing w:after="0"/>
-        <w:jc w:val="both"/>
-        <w:rPr>
-          <w:rFonts w:ascii="Arial" w:hAnsi="Arial" w:cs="Arial"/>
-          <w:sz w:val="26"/>
-          <w:szCs w:val="26"/>
-        </w:rPr>
-      </w:pPr>
-    </w:p>
-    <w:p>
-      <w:pPr>
-        <w:spacing w:after="0"/>
-        <w:jc w:val="both"/>
-        <w:rPr>
-          <w:rFonts w:ascii="Arial" w:hAnsi="Arial" w:cs="Arial"/>
-          <w:sz w:val="26"/>
-          <w:szCs w:val="26"/>
-        </w:rPr>
-      </w:pPr>
-    </w:p>
-    <w:p>
-      <w:pPr>
-        <w:spacing w:after="0"/>
-        <w:jc w:val="both"/>
-        <w:rPr>
-          <w:rFonts w:ascii="Arial" w:hAnsi="Arial" w:cs="Arial"/>
-          <w:sz w:val="26"/>
-          <w:szCs w:val="26"/>
-        </w:rPr>
-      </w:pPr>
+        <w:t>mantener un historial de ventas y facilitar los movimientos en el día de productos vendidos.</w:t>
+      </w:r>
+    </w:p>
+    <w:p>
+      <w:pPr>
+        <w:spacing w:after="0"/>
+        <w:jc w:val="both"/>
+        <w:rPr>
+          <w:rFonts w:ascii="Arial" w:hAnsi="Arial" w:cs="Arial"/>
+          <w:sz w:val="26"/>
+          <w:szCs w:val="26"/>
+        </w:rPr>
+      </w:pPr>
+    </w:p>
+    <w:p>
+      <w:pPr>
+        <w:spacing w:after="0"/>
+        <w:jc w:val="both"/>
+        <w:rPr>
+          <w:rFonts w:ascii="Arial" w:hAnsi="Arial" w:cs="Arial"/>
+          <w:sz w:val="26"/>
+          <w:szCs w:val="26"/>
+        </w:rPr>
+      </w:pPr>
+      <w:r>
+        <w:rPr>
+          <w:rFonts w:ascii="Arial" w:hAnsi="Arial" w:cs="Arial"/>
+          <w:b/>
+          <w:bCs/>
+          <w:sz w:val="26"/>
+          <w:szCs w:val="26"/>
+        </w:rPr>
+        <w:t xml:space="preserve">Como </w:t>
+      </w:r>
+      <w:r>
+        <w:rPr>
+          <w:rFonts w:ascii="Arial" w:hAnsi="Arial" w:cs="Arial"/>
+          <w:sz w:val="26"/>
+          <w:szCs w:val="26"/>
+        </w:rPr>
+        <w:t>operador de cibercafé,</w:t>
+      </w:r>
+    </w:p>
+    <w:p>
+      <w:pPr>
+        <w:spacing w:after="0"/>
+        <w:jc w:val="both"/>
+        <w:rPr>
+          <w:rFonts w:ascii="Arial" w:hAnsi="Arial" w:cs="Arial"/>
+          <w:sz w:val="26"/>
+          <w:szCs w:val="26"/>
+        </w:rPr>
+      </w:pPr>
+      <w:r>
+        <w:rPr>
+          <w:rFonts w:ascii="Arial" w:hAnsi="Arial" w:cs="Arial"/>
+          <w:b/>
+          <w:bCs/>
+          <w:sz w:val="26"/>
+          <w:szCs w:val="26"/>
+        </w:rPr>
+        <w:t xml:space="preserve">Quiero </w:t>
+      </w:r>
+      <w:r>
+        <w:rPr>
+          <w:rFonts w:ascii="Arial" w:hAnsi="Arial" w:cs="Arial"/>
+          <w:sz w:val="26"/>
+          <w:szCs w:val="26"/>
+        </w:rPr>
+        <w:t>modificar</w:t>
+      </w:r>
+      <w:r>
+        <w:rPr>
+          <w:rFonts w:ascii="Arial" w:hAnsi="Arial" w:cs="Arial"/>
+          <w:sz w:val="26"/>
+          <w:szCs w:val="26"/>
+        </w:rPr>
+        <w:t xml:space="preserve"> facturas electrónicas de servicios (Impresiones, copias, transcripciones, escáner, etc.)</w:t>
+      </w:r>
+    </w:p>
+    <w:p>
+      <w:pPr>
+        <w:spacing w:after="0"/>
+        <w:jc w:val="both"/>
+        <w:rPr>
+          <w:rFonts w:ascii="Arial" w:hAnsi="Arial" w:cs="Arial"/>
+          <w:sz w:val="26"/>
+          <w:szCs w:val="26"/>
+        </w:rPr>
+      </w:pPr>
+      <w:r>
+        <w:rPr>
+          <w:rFonts w:ascii="Arial" w:hAnsi="Arial" w:cs="Arial"/>
+          <w:b/>
+          <w:bCs/>
+          <w:sz w:val="26"/>
+          <w:szCs w:val="26"/>
+        </w:rPr>
+        <w:t xml:space="preserve">Para </w:t>
+      </w:r>
+      <w:r>
+        <w:rPr>
+          <w:rFonts w:ascii="Arial" w:hAnsi="Arial" w:cs="Arial"/>
+          <w:sz w:val="26"/>
+          <w:szCs w:val="26"/>
+        </w:rPr>
+        <w:t>corregir</w:t>
+      </w:r>
+      <w:r>
+        <w:rPr>
+          <w:rFonts w:ascii="Arial" w:hAnsi="Arial" w:cs="Arial"/>
+          <w:sz w:val="26"/>
+          <w:szCs w:val="26"/>
+        </w:rPr>
+        <w:t xml:space="preserve"> un historial </w:t>
+      </w:r>
+      <w:r>
+        <w:rPr>
+          <w:rFonts w:ascii="Arial" w:hAnsi="Arial" w:cs="Arial"/>
+          <w:sz w:val="26"/>
+          <w:szCs w:val="26"/>
+        </w:rPr>
+        <w:t>si me equivoqué a la hora de digitar un dato,</w:t>
+      </w:r>
+    </w:p>
+    <w:p>
+      <w:pPr>
+        <w:spacing w:after="0"/>
+        <w:jc w:val="both"/>
+        <w:rPr>
+          <w:rFonts w:ascii="Arial" w:hAnsi="Arial" w:cs="Arial"/>
+          <w:sz w:val="26"/>
+          <w:szCs w:val="26"/>
+        </w:rPr>
+      </w:pPr>
+      <w:r>
+        <w:rPr>
+          <w:rFonts w:ascii="Arial" w:hAnsi="Arial" w:cs="Arial"/>
+          <w:b/>
+          <w:bCs/>
+          <w:sz w:val="26"/>
+          <w:szCs w:val="26"/>
+        </w:rPr>
+        <w:t xml:space="preserve">Pero </w:t>
+      </w:r>
+      <w:r>
+        <w:rPr>
+          <w:rFonts w:ascii="Arial" w:hAnsi="Arial" w:cs="Arial"/>
+          <w:sz w:val="26"/>
+          <w:szCs w:val="26"/>
+        </w:rPr>
+        <w:t>necesito una clave del administrador.</w:t>
+      </w:r>
+    </w:p>
+    <w:p>
+      <w:pPr>
+        <w:spacing w:after="0"/>
+        <w:jc w:val="both"/>
+        <w:rPr>
+          <w:rFonts w:ascii="Arial" w:hAnsi="Arial" w:cs="Arial"/>
+          <w:sz w:val="26"/>
+          <w:szCs w:val="26"/>
+        </w:rPr>
+      </w:pPr>
+    </w:p>
+    <w:p>
+      <w:pPr>
+        <w:spacing w:after="0"/>
+        <w:jc w:val="both"/>
+        <w:rPr>
+          <w:rFonts w:ascii="Arial" w:hAnsi="Arial" w:cs="Arial"/>
+          <w:sz w:val="26"/>
+          <w:szCs w:val="26"/>
+        </w:rPr>
+      </w:pPr>
+    </w:p>
+    <w:p>
+      <w:pPr>
+        <w:spacing w:after="0"/>
+        <w:jc w:val="both"/>
+        <w:rPr>
+          <w:rFonts w:ascii="Arial" w:hAnsi="Arial" w:cs="Arial"/>
+          <w:sz w:val="26"/>
+          <w:szCs w:val="26"/>
+        </w:rPr>
+      </w:pPr>
+      <w:r>
+        <w:rPr>
+          <w:rFonts w:ascii="Arial" w:hAnsi="Arial" w:cs="Arial"/>
+          <w:b/>
+          <w:bCs/>
+          <w:sz w:val="26"/>
+          <w:szCs w:val="26"/>
+        </w:rPr>
+        <w:lastRenderedPageBreak/>
+        <w:t xml:space="preserve">Como </w:t>
+      </w:r>
+      <w:r>
+        <w:rPr>
+          <w:rFonts w:ascii="Arial" w:hAnsi="Arial" w:cs="Arial"/>
+          <w:sz w:val="26"/>
+          <w:szCs w:val="26"/>
+        </w:rPr>
+        <w:t>operador de cibercafé,</w:t>
+      </w:r>
+    </w:p>
+    <w:p>
+      <w:pPr>
+        <w:spacing w:after="0"/>
+        <w:jc w:val="both"/>
+        <w:rPr>
+          <w:rFonts w:ascii="Arial" w:hAnsi="Arial" w:cs="Arial"/>
+          <w:sz w:val="26"/>
+          <w:szCs w:val="26"/>
+        </w:rPr>
+      </w:pPr>
+      <w:r>
+        <w:rPr>
+          <w:rFonts w:ascii="Arial" w:hAnsi="Arial" w:cs="Arial"/>
+          <w:b/>
+          <w:bCs/>
+          <w:sz w:val="26"/>
+          <w:szCs w:val="26"/>
+        </w:rPr>
+        <w:t xml:space="preserve">Quiero </w:t>
+      </w:r>
+      <w:r>
+        <w:rPr>
+          <w:rFonts w:ascii="Arial" w:hAnsi="Arial" w:cs="Arial"/>
+          <w:sz w:val="26"/>
+          <w:szCs w:val="26"/>
+        </w:rPr>
+        <w:t>eliminar</w:t>
+      </w:r>
+      <w:r>
+        <w:rPr>
+          <w:rFonts w:ascii="Arial" w:hAnsi="Arial" w:cs="Arial"/>
+          <w:sz w:val="26"/>
+          <w:szCs w:val="26"/>
+        </w:rPr>
+        <w:t xml:space="preserve"> facturas electrónicas de servicios (Impresiones, copias, transcripciones, escáner, etc.)</w:t>
+      </w:r>
+    </w:p>
+    <w:p>
+      <w:pPr>
+        <w:spacing w:after="0"/>
+        <w:jc w:val="both"/>
+        <w:rPr>
+          <w:rFonts w:ascii="Arial" w:hAnsi="Arial" w:cs="Arial"/>
+          <w:sz w:val="26"/>
+          <w:szCs w:val="26"/>
+        </w:rPr>
+      </w:pPr>
+      <w:r>
+        <w:rPr>
+          <w:rFonts w:ascii="Arial" w:hAnsi="Arial" w:cs="Arial"/>
+          <w:b/>
+          <w:bCs/>
+          <w:sz w:val="26"/>
+          <w:szCs w:val="26"/>
+        </w:rPr>
+        <w:t xml:space="preserve">Para </w:t>
+      </w:r>
+      <w:r>
+        <w:rPr>
+          <w:rFonts w:ascii="Arial" w:hAnsi="Arial" w:cs="Arial"/>
+          <w:sz w:val="26"/>
+          <w:szCs w:val="26"/>
+        </w:rPr>
+        <w:t xml:space="preserve">borrar una factura </w:t>
+      </w:r>
+      <w:r>
+        <w:rPr>
+          <w:rFonts w:ascii="Arial" w:hAnsi="Arial" w:cs="Arial"/>
+          <w:sz w:val="26"/>
+          <w:szCs w:val="26"/>
+        </w:rPr>
+        <w:t xml:space="preserve">si me </w:t>
+      </w:r>
+      <w:r>
+        <w:rPr>
+          <w:rFonts w:ascii="Arial" w:hAnsi="Arial" w:cs="Arial"/>
+          <w:sz w:val="26"/>
+          <w:szCs w:val="26"/>
+        </w:rPr>
+        <w:t>equivoque o no era necesaria</w:t>
+      </w:r>
+      <w:r>
+        <w:rPr>
+          <w:rFonts w:ascii="Arial" w:hAnsi="Arial" w:cs="Arial"/>
+          <w:sz w:val="26"/>
+          <w:szCs w:val="26"/>
+        </w:rPr>
+        <w:t>,</w:t>
+      </w:r>
+    </w:p>
+    <w:p>
+      <w:pPr>
+        <w:spacing w:after="0"/>
+        <w:jc w:val="both"/>
+        <w:rPr>
+          <w:rFonts w:ascii="Arial" w:hAnsi="Arial" w:cs="Arial"/>
+          <w:sz w:val="26"/>
+          <w:szCs w:val="26"/>
+        </w:rPr>
+      </w:pPr>
+      <w:r>
+        <w:rPr>
+          <w:rFonts w:ascii="Arial" w:hAnsi="Arial" w:cs="Arial"/>
+          <w:b/>
+          <w:bCs/>
+          <w:sz w:val="26"/>
+          <w:szCs w:val="26"/>
+        </w:rPr>
+        <w:t xml:space="preserve">Pero </w:t>
+      </w:r>
+      <w:r>
+        <w:rPr>
+          <w:rFonts w:ascii="Arial" w:hAnsi="Arial" w:cs="Arial"/>
+          <w:sz w:val="26"/>
+          <w:szCs w:val="26"/>
+        </w:rPr>
+        <w:t>necesito una clave del administrador.</w:t>
+      </w:r>
     </w:p>
     <w:p>
       <w:pPr>
@@ -1217,61 +1446,698 @@
           <w:sz w:val="26"/>
           <w:szCs w:val="26"/>
         </w:rPr>
+        <w:t xml:space="preserve">PERSPECTIVA DE </w:t>
+      </w:r>
+      <w:r>
+        <w:rPr>
+          <w:rFonts w:ascii="Arial" w:hAnsi="Arial" w:cs="Arial"/>
+          <w:b/>
+          <w:bCs/>
+          <w:sz w:val="26"/>
+          <w:szCs w:val="26"/>
+        </w:rPr>
+        <w:t>ADMINISTRADOR</w:t>
+      </w:r>
+      <w:r>
+        <w:rPr>
+          <w:rFonts w:ascii="Arial" w:hAnsi="Arial" w:cs="Arial"/>
+          <w:b/>
+          <w:bCs/>
+          <w:sz w:val="26"/>
+          <w:szCs w:val="26"/>
+        </w:rPr>
+        <w:t>:</w:t>
+      </w:r>
+    </w:p>
+    <w:p>
+      <w:pPr>
+        <w:spacing w:after="0"/>
+        <w:jc w:val="both"/>
+        <w:rPr>
+          <w:rFonts w:ascii="Arial" w:hAnsi="Arial" w:cs="Arial"/>
+          <w:b/>
+          <w:bCs/>
+          <w:sz w:val="26"/>
+          <w:szCs w:val="26"/>
+        </w:rPr>
+      </w:pPr>
+    </w:p>
+    <w:p>
+      <w:pPr>
+        <w:spacing w:after="0"/>
+        <w:jc w:val="both"/>
+        <w:rPr>
+          <w:rFonts w:ascii="Arial" w:hAnsi="Arial" w:cs="Arial"/>
+          <w:sz w:val="26"/>
+          <w:szCs w:val="26"/>
+        </w:rPr>
+      </w:pPr>
+      <w:r>
+        <w:rPr>
+          <w:rFonts w:ascii="Arial" w:hAnsi="Arial" w:cs="Arial"/>
+          <w:b/>
+          <w:bCs/>
+          <w:sz w:val="26"/>
+          <w:szCs w:val="26"/>
+        </w:rPr>
+        <w:t xml:space="preserve">Como </w:t>
+      </w:r>
+      <w:r>
+        <w:rPr>
+          <w:rFonts w:ascii="Arial" w:hAnsi="Arial" w:cs="Arial"/>
+          <w:sz w:val="26"/>
+          <w:szCs w:val="26"/>
+        </w:rPr>
+        <w:t>administrador,</w:t>
+      </w:r>
+    </w:p>
+    <w:p>
+      <w:pPr>
+        <w:spacing w:after="0"/>
+        <w:jc w:val="both"/>
+        <w:rPr>
+          <w:rFonts w:ascii="Arial" w:hAnsi="Arial" w:cs="Arial"/>
+          <w:sz w:val="26"/>
+          <w:szCs w:val="26"/>
+        </w:rPr>
+      </w:pPr>
+      <w:r>
+        <w:rPr>
+          <w:rFonts w:ascii="Arial" w:hAnsi="Arial" w:cs="Arial"/>
+          <w:b/>
+          <w:bCs/>
+          <w:sz w:val="26"/>
+          <w:szCs w:val="26"/>
+        </w:rPr>
+        <w:t xml:space="preserve">Quiero </w:t>
+      </w:r>
+      <w:r>
+        <w:rPr>
+          <w:rFonts w:ascii="Arial" w:hAnsi="Arial" w:cs="Arial"/>
+          <w:sz w:val="26"/>
+          <w:szCs w:val="26"/>
+        </w:rPr>
+        <w:t>registrar, actualizar o eliminar datos de servicios ofrecidos, papelería, ropa, horarios e información general del negocio,</w:t>
+      </w:r>
+    </w:p>
+    <w:p>
+      <w:pPr>
+        <w:spacing w:after="0"/>
+        <w:jc w:val="both"/>
+        <w:rPr>
+          <w:rFonts w:ascii="Arial" w:hAnsi="Arial" w:cs="Arial"/>
+          <w:sz w:val="26"/>
+          <w:szCs w:val="26"/>
+        </w:rPr>
+      </w:pPr>
+      <w:r>
+        <w:rPr>
+          <w:rFonts w:ascii="Arial" w:hAnsi="Arial" w:cs="Arial"/>
+          <w:b/>
+          <w:bCs/>
+          <w:sz w:val="26"/>
+          <w:szCs w:val="26"/>
+        </w:rPr>
+        <w:t xml:space="preserve">Para </w:t>
+      </w:r>
+      <w:r>
+        <w:rPr>
+          <w:rFonts w:ascii="Arial" w:hAnsi="Arial" w:cs="Arial"/>
+          <w:sz w:val="26"/>
+          <w:szCs w:val="26"/>
+        </w:rPr>
+        <w:t>enriquecer el sistema con la información vigente del negocio.</w:t>
+      </w:r>
+    </w:p>
+    <w:p>
+      <w:pPr>
+        <w:spacing w:after="0"/>
+        <w:jc w:val="both"/>
+        <w:rPr>
+          <w:rFonts w:ascii="Arial" w:hAnsi="Arial" w:cs="Arial"/>
+          <w:sz w:val="26"/>
+          <w:szCs w:val="26"/>
+        </w:rPr>
+      </w:pPr>
+    </w:p>
+    <w:p>
+      <w:pPr>
+        <w:spacing w:after="0"/>
+        <w:jc w:val="both"/>
+        <w:rPr>
+          <w:rFonts w:ascii="Arial" w:hAnsi="Arial" w:cs="Arial"/>
+          <w:sz w:val="26"/>
+          <w:szCs w:val="26"/>
+        </w:rPr>
+      </w:pPr>
+      <w:r>
+        <w:rPr>
+          <w:rFonts w:ascii="Arial" w:hAnsi="Arial" w:cs="Arial"/>
+          <w:b/>
+          <w:bCs/>
+          <w:sz w:val="26"/>
+          <w:szCs w:val="26"/>
+        </w:rPr>
+        <w:t xml:space="preserve">Como </w:t>
+      </w:r>
+      <w:r>
+        <w:rPr>
+          <w:rFonts w:ascii="Arial" w:hAnsi="Arial" w:cs="Arial"/>
+          <w:sz w:val="26"/>
+          <w:szCs w:val="26"/>
+        </w:rPr>
+        <w:t>administrador,</w:t>
+      </w:r>
+    </w:p>
+    <w:p>
+      <w:pPr>
+        <w:spacing w:after="0"/>
+        <w:jc w:val="both"/>
+        <w:rPr>
+          <w:rFonts w:ascii="Arial" w:hAnsi="Arial" w:cs="Arial"/>
+          <w:sz w:val="26"/>
+          <w:szCs w:val="26"/>
+        </w:rPr>
+      </w:pPr>
+      <w:r>
+        <w:rPr>
+          <w:rFonts w:ascii="Arial" w:hAnsi="Arial" w:cs="Arial"/>
+          <w:b/>
+          <w:bCs/>
+          <w:sz w:val="26"/>
+          <w:szCs w:val="26"/>
+        </w:rPr>
+        <w:t xml:space="preserve">Quiero </w:t>
+      </w:r>
+      <w:r>
+        <w:rPr>
+          <w:rFonts w:ascii="Arial" w:hAnsi="Arial" w:cs="Arial"/>
+          <w:sz w:val="26"/>
+          <w:szCs w:val="26"/>
+        </w:rPr>
+        <w:t>registrar, actualizar o eliminar datos personales de operadores de cibercafé o míos,</w:t>
+      </w:r>
+    </w:p>
+    <w:p>
+      <w:pPr>
+        <w:spacing w:after="0"/>
+        <w:jc w:val="both"/>
+        <w:rPr>
+          <w:rFonts w:ascii="Arial" w:hAnsi="Arial" w:cs="Arial"/>
+          <w:sz w:val="26"/>
+          <w:szCs w:val="26"/>
+        </w:rPr>
+      </w:pPr>
+      <w:r>
+        <w:rPr>
+          <w:rFonts w:ascii="Arial" w:hAnsi="Arial" w:cs="Arial"/>
+          <w:b/>
+          <w:bCs/>
+          <w:sz w:val="26"/>
+          <w:szCs w:val="26"/>
+        </w:rPr>
+        <w:t xml:space="preserve">Para </w:t>
+      </w:r>
+      <w:r>
+        <w:rPr>
+          <w:rFonts w:ascii="Arial" w:hAnsi="Arial" w:cs="Arial"/>
+          <w:sz w:val="26"/>
+          <w:szCs w:val="26"/>
+        </w:rPr>
+        <w:t>agregar operadores de cibercafé, ya que solo hay un solo administrador; y modificar datos necesarios.</w:t>
+      </w:r>
+    </w:p>
+    <w:p>
+      <w:pPr>
+        <w:spacing w:after="0"/>
+        <w:jc w:val="both"/>
+        <w:rPr>
+          <w:rFonts w:ascii="Arial" w:hAnsi="Arial" w:cs="Arial"/>
+          <w:sz w:val="26"/>
+          <w:szCs w:val="26"/>
+        </w:rPr>
+      </w:pPr>
+    </w:p>
+    <w:p>
+      <w:pPr>
+        <w:spacing w:after="0"/>
+        <w:jc w:val="both"/>
+        <w:rPr>
+          <w:rFonts w:ascii="Arial" w:hAnsi="Arial" w:cs="Arial"/>
+          <w:sz w:val="26"/>
+          <w:szCs w:val="26"/>
+        </w:rPr>
+      </w:pPr>
+      <w:r>
+        <w:rPr>
+          <w:rFonts w:ascii="Arial" w:hAnsi="Arial" w:cs="Arial"/>
+          <w:b/>
+          <w:bCs/>
+          <w:sz w:val="26"/>
+          <w:szCs w:val="26"/>
+        </w:rPr>
+        <w:t xml:space="preserve">Como </w:t>
+      </w:r>
+      <w:r>
+        <w:rPr>
+          <w:rFonts w:ascii="Arial" w:hAnsi="Arial" w:cs="Arial"/>
+          <w:sz w:val="26"/>
+          <w:szCs w:val="26"/>
+        </w:rPr>
+        <w:t>administrador,</w:t>
+      </w:r>
+    </w:p>
+    <w:p>
+      <w:pPr>
+        <w:spacing w:after="0"/>
+        <w:jc w:val="both"/>
+        <w:rPr>
+          <w:rFonts w:ascii="Arial" w:hAnsi="Arial" w:cs="Arial"/>
+          <w:sz w:val="26"/>
+          <w:szCs w:val="26"/>
+        </w:rPr>
+      </w:pPr>
+      <w:r>
+        <w:rPr>
+          <w:rFonts w:ascii="Arial" w:hAnsi="Arial" w:cs="Arial"/>
+          <w:b/>
+          <w:bCs/>
+          <w:sz w:val="26"/>
+          <w:szCs w:val="26"/>
+        </w:rPr>
+        <w:t xml:space="preserve">Quiero </w:t>
+      </w:r>
+      <w:r>
+        <w:rPr>
+          <w:rFonts w:ascii="Arial" w:hAnsi="Arial" w:cs="Arial"/>
+          <w:sz w:val="26"/>
+          <w:szCs w:val="26"/>
+        </w:rPr>
+        <w:t>generar reportes generales del negocio, papelería o servicios ofrecidos,</w:t>
+      </w:r>
+    </w:p>
+    <w:p>
+      <w:pPr>
+        <w:spacing w:after="0"/>
+        <w:jc w:val="both"/>
+        <w:rPr>
+          <w:rFonts w:ascii="Arial" w:hAnsi="Arial" w:cs="Arial"/>
+          <w:sz w:val="26"/>
+          <w:szCs w:val="26"/>
+        </w:rPr>
+      </w:pPr>
+      <w:r>
+        <w:rPr>
+          <w:rFonts w:ascii="Arial" w:hAnsi="Arial" w:cs="Arial"/>
+          <w:b/>
+          <w:bCs/>
+          <w:sz w:val="26"/>
+          <w:szCs w:val="26"/>
+        </w:rPr>
+        <w:t xml:space="preserve">Para </w:t>
+      </w:r>
+      <w:r>
+        <w:rPr>
+          <w:rFonts w:ascii="Arial" w:hAnsi="Arial" w:cs="Arial"/>
+          <w:sz w:val="26"/>
+          <w:szCs w:val="26"/>
+        </w:rPr>
+        <w:t>tener conocimiento de cómo está mi negocio en movimientos y ver las estadísticas.</w:t>
+      </w:r>
+    </w:p>
+    <w:p>
+      <w:pPr>
+        <w:spacing w:after="0"/>
+        <w:jc w:val="both"/>
+        <w:rPr>
+          <w:rFonts w:ascii="Arial" w:hAnsi="Arial" w:cs="Arial"/>
+          <w:sz w:val="26"/>
+          <w:szCs w:val="26"/>
+        </w:rPr>
+      </w:pPr>
+    </w:p>
+    <w:p>
+      <w:pPr>
+        <w:spacing w:after="0"/>
+        <w:jc w:val="both"/>
+        <w:rPr>
+          <w:rFonts w:ascii="Arial" w:hAnsi="Arial" w:cs="Arial"/>
+          <w:sz w:val="26"/>
+          <w:szCs w:val="26"/>
+        </w:rPr>
+      </w:pPr>
+      <w:r>
+        <w:rPr>
+          <w:rFonts w:ascii="Arial" w:hAnsi="Arial" w:cs="Arial"/>
+          <w:b/>
+          <w:bCs/>
+          <w:sz w:val="26"/>
+          <w:szCs w:val="26"/>
+        </w:rPr>
+        <w:t xml:space="preserve">Como </w:t>
+      </w:r>
+      <w:r>
+        <w:rPr>
+          <w:rFonts w:ascii="Arial" w:hAnsi="Arial" w:cs="Arial"/>
+          <w:sz w:val="26"/>
+          <w:szCs w:val="26"/>
+        </w:rPr>
+        <w:t>administrador,</w:t>
+      </w:r>
+    </w:p>
+    <w:p>
+      <w:pPr>
+        <w:spacing w:after="0"/>
+        <w:jc w:val="both"/>
+        <w:rPr>
+          <w:rFonts w:ascii="Arial" w:hAnsi="Arial" w:cs="Arial"/>
+          <w:sz w:val="26"/>
+          <w:szCs w:val="26"/>
+        </w:rPr>
+      </w:pPr>
+      <w:r>
+        <w:rPr>
+          <w:rFonts w:ascii="Arial" w:hAnsi="Arial" w:cs="Arial"/>
+          <w:b/>
+          <w:bCs/>
+          <w:sz w:val="26"/>
+          <w:szCs w:val="26"/>
+        </w:rPr>
+        <w:t>Quiero</w:t>
+      </w:r>
+      <w:r>
+        <w:rPr>
+          <w:rFonts w:ascii="Arial" w:hAnsi="Arial" w:cs="Arial"/>
+          <w:b/>
+          <w:bCs/>
+          <w:sz w:val="26"/>
+          <w:szCs w:val="26"/>
+        </w:rPr>
+        <w:t xml:space="preserve"> </w:t>
+      </w:r>
+      <w:r>
+        <w:rPr>
+          <w:rFonts w:ascii="Arial" w:hAnsi="Arial" w:cs="Arial"/>
+          <w:sz w:val="26"/>
+          <w:szCs w:val="26"/>
+        </w:rPr>
+        <w:t>obtener cálculos de ingresos generado en papelería o servicios,</w:t>
+      </w:r>
+    </w:p>
+    <w:p>
+      <w:pPr>
+        <w:spacing w:after="0"/>
+        <w:jc w:val="both"/>
+        <w:rPr>
+          <w:rFonts w:ascii="Arial" w:hAnsi="Arial" w:cs="Arial"/>
+          <w:sz w:val="26"/>
+          <w:szCs w:val="26"/>
+        </w:rPr>
+      </w:pPr>
+      <w:r>
+        <w:rPr>
+          <w:rFonts w:ascii="Arial" w:hAnsi="Arial" w:cs="Arial"/>
+          <w:b/>
+          <w:bCs/>
+          <w:sz w:val="26"/>
+          <w:szCs w:val="26"/>
+        </w:rPr>
+        <w:t xml:space="preserve">Para </w:t>
+      </w:r>
+      <w:r>
+        <w:rPr>
+          <w:rFonts w:ascii="Arial" w:hAnsi="Arial" w:cs="Arial"/>
+          <w:sz w:val="26"/>
+          <w:szCs w:val="26"/>
+        </w:rPr>
+        <w:t>saber si estoy teniendo ganancias, pérdidas o estoy en punto de equilibrio.</w:t>
+      </w:r>
+    </w:p>
+    <w:p>
+      <w:pPr>
+        <w:spacing w:after="0"/>
+        <w:jc w:val="both"/>
+        <w:rPr>
+          <w:rFonts w:ascii="Arial" w:hAnsi="Arial" w:cs="Arial"/>
+          <w:sz w:val="26"/>
+          <w:szCs w:val="26"/>
+        </w:rPr>
+      </w:pPr>
+    </w:p>
+    <w:p>
+      <w:pPr>
+        <w:spacing w:after="0"/>
+        <w:jc w:val="both"/>
+        <w:rPr>
+          <w:rFonts w:ascii="Arial" w:hAnsi="Arial" w:cs="Arial"/>
+          <w:sz w:val="26"/>
+          <w:szCs w:val="26"/>
+        </w:rPr>
+      </w:pPr>
+      <w:r>
+        <w:rPr>
+          <w:rFonts w:ascii="Arial" w:hAnsi="Arial" w:cs="Arial"/>
+          <w:b/>
+          <w:bCs/>
+          <w:sz w:val="26"/>
+          <w:szCs w:val="26"/>
+        </w:rPr>
+        <w:t xml:space="preserve">Como </w:t>
+      </w:r>
+      <w:r>
+        <w:rPr>
+          <w:rFonts w:ascii="Arial" w:hAnsi="Arial" w:cs="Arial"/>
+          <w:sz w:val="26"/>
+          <w:szCs w:val="26"/>
+        </w:rPr>
+        <w:t>administrador,</w:t>
+      </w:r>
+    </w:p>
+    <w:p>
+      <w:pPr>
+        <w:spacing w:after="0"/>
+        <w:jc w:val="both"/>
+        <w:rPr>
+          <w:rFonts w:ascii="Arial" w:hAnsi="Arial" w:cs="Arial"/>
+          <w:sz w:val="26"/>
+          <w:szCs w:val="26"/>
+        </w:rPr>
+      </w:pPr>
+      <w:r>
+        <w:rPr>
+          <w:rFonts w:ascii="Arial" w:hAnsi="Arial" w:cs="Arial"/>
+          <w:b/>
+          <w:bCs/>
+          <w:sz w:val="26"/>
+          <w:szCs w:val="26"/>
+        </w:rPr>
+        <w:t>Quiero</w:t>
+      </w:r>
+      <w:r>
+        <w:rPr>
+          <w:rFonts w:ascii="Arial" w:hAnsi="Arial" w:cs="Arial"/>
+          <w:b/>
+          <w:bCs/>
+          <w:sz w:val="26"/>
+          <w:szCs w:val="26"/>
+        </w:rPr>
+        <w:t xml:space="preserve"> </w:t>
+      </w:r>
+      <w:r>
+        <w:rPr>
+          <w:rFonts w:ascii="Arial" w:hAnsi="Arial" w:cs="Arial"/>
+          <w:sz w:val="26"/>
+          <w:szCs w:val="26"/>
+        </w:rPr>
+        <w:t>tener estadísticas cuantitativas y cualitativas sin tener que generar reportes,</w:t>
+      </w:r>
+    </w:p>
+    <w:p>
+      <w:pPr>
+        <w:spacing w:after="0"/>
+        <w:jc w:val="both"/>
+        <w:rPr>
+          <w:rFonts w:ascii="Arial" w:hAnsi="Arial" w:cs="Arial"/>
+          <w:sz w:val="26"/>
+          <w:szCs w:val="26"/>
+        </w:rPr>
+      </w:pPr>
+      <w:r>
+        <w:rPr>
+          <w:rFonts w:ascii="Arial" w:hAnsi="Arial" w:cs="Arial"/>
+          <w:b/>
+          <w:bCs/>
+          <w:sz w:val="26"/>
+          <w:szCs w:val="26"/>
+        </w:rPr>
+        <w:t xml:space="preserve">Para </w:t>
+      </w:r>
+      <w:r>
+        <w:rPr>
+          <w:rFonts w:ascii="Arial" w:hAnsi="Arial" w:cs="Arial"/>
+          <w:sz w:val="26"/>
+          <w:szCs w:val="26"/>
+        </w:rPr>
+        <w:t>observar a simple vista información que necesito consultar.</w:t>
+      </w:r>
+    </w:p>
+    <w:p>
+      <w:pPr>
+        <w:spacing w:after="0"/>
+        <w:jc w:val="both"/>
+        <w:rPr>
+          <w:rFonts w:ascii="Arial" w:hAnsi="Arial" w:cs="Arial"/>
+          <w:sz w:val="26"/>
+          <w:szCs w:val="26"/>
+        </w:rPr>
+      </w:pPr>
+    </w:p>
+    <w:p>
+      <w:pPr>
+        <w:spacing w:after="0"/>
+        <w:jc w:val="both"/>
+        <w:rPr>
+          <w:rFonts w:ascii="Arial" w:hAnsi="Arial" w:cs="Arial"/>
+          <w:sz w:val="26"/>
+          <w:szCs w:val="26"/>
+        </w:rPr>
+      </w:pPr>
+      <w:r>
+        <w:rPr>
+          <w:rFonts w:ascii="Arial" w:hAnsi="Arial" w:cs="Arial"/>
+          <w:b/>
+          <w:bCs/>
+          <w:sz w:val="26"/>
+          <w:szCs w:val="26"/>
+        </w:rPr>
+        <w:t xml:space="preserve">Como </w:t>
+      </w:r>
+      <w:r>
+        <w:rPr>
+          <w:rFonts w:ascii="Arial" w:hAnsi="Arial" w:cs="Arial"/>
+          <w:sz w:val="26"/>
+          <w:szCs w:val="26"/>
+        </w:rPr>
+        <w:t>administrador,</w:t>
+      </w:r>
+    </w:p>
+    <w:p>
+      <w:pPr>
+        <w:spacing w:after="0"/>
+        <w:jc w:val="both"/>
+        <w:rPr>
+          <w:rFonts w:ascii="Arial" w:hAnsi="Arial" w:cs="Arial"/>
+          <w:sz w:val="26"/>
+          <w:szCs w:val="26"/>
+        </w:rPr>
+      </w:pPr>
+      <w:r>
+        <w:rPr>
+          <w:rFonts w:ascii="Arial" w:hAnsi="Arial" w:cs="Arial"/>
+          <w:b/>
+          <w:bCs/>
+          <w:sz w:val="26"/>
+          <w:szCs w:val="26"/>
+        </w:rPr>
+        <w:t>Quiero</w:t>
+      </w:r>
+      <w:r>
+        <w:rPr>
+          <w:rFonts w:ascii="Arial" w:hAnsi="Arial" w:cs="Arial"/>
+          <w:b/>
+          <w:bCs/>
+          <w:sz w:val="26"/>
+          <w:szCs w:val="26"/>
+        </w:rPr>
+        <w:t xml:space="preserve"> </w:t>
+      </w:r>
+      <w:r>
+        <w:rPr>
+          <w:rFonts w:ascii="Arial" w:hAnsi="Arial" w:cs="Arial"/>
+          <w:sz w:val="26"/>
+          <w:szCs w:val="26"/>
+        </w:rPr>
+        <w:t>obtener historiales del negocio</w:t>
+      </w:r>
+      <w:r>
+        <w:rPr>
+          <w:rFonts w:ascii="Arial" w:hAnsi="Arial" w:cs="Arial"/>
+          <w:sz w:val="26"/>
+          <w:szCs w:val="26"/>
+        </w:rPr>
+        <w:t>,</w:t>
+      </w:r>
+    </w:p>
+    <w:p>
+      <w:pPr>
+        <w:spacing w:after="0"/>
+        <w:jc w:val="both"/>
+        <w:rPr>
+          <w:rFonts w:ascii="Arial" w:hAnsi="Arial" w:cs="Arial"/>
+          <w:sz w:val="26"/>
+          <w:szCs w:val="26"/>
+        </w:rPr>
+      </w:pPr>
+      <w:r>
+        <w:rPr>
+          <w:rFonts w:ascii="Arial" w:hAnsi="Arial" w:cs="Arial"/>
+          <w:b/>
+          <w:bCs/>
+          <w:sz w:val="26"/>
+          <w:szCs w:val="26"/>
+        </w:rPr>
+        <w:t xml:space="preserve">Para </w:t>
+      </w:r>
+      <w:r>
+        <w:rPr>
+          <w:rFonts w:ascii="Arial" w:hAnsi="Arial" w:cs="Arial"/>
+          <w:sz w:val="26"/>
+          <w:szCs w:val="26"/>
+        </w:rPr>
+        <w:t>llevar un seguimiento</w:t>
+      </w:r>
+    </w:p>
+    <w:p>
+      <w:pPr>
+        <w:spacing w:after="0"/>
+        <w:jc w:val="both"/>
+        <w:rPr>
+          <w:rFonts w:ascii="Arial" w:hAnsi="Arial" w:cs="Arial"/>
+          <w:sz w:val="26"/>
+          <w:szCs w:val="26"/>
+        </w:rPr>
+      </w:pPr>
+    </w:p>
+    <w:p>
+      <w:pPr>
+        <w:spacing w:after="0"/>
+        <w:jc w:val="both"/>
+        <w:rPr>
+          <w:rFonts w:ascii="Arial" w:hAnsi="Arial" w:cs="Arial"/>
+          <w:sz w:val="26"/>
+          <w:szCs w:val="26"/>
+        </w:rPr>
+      </w:pPr>
+    </w:p>
+    <w:p>
+      <w:pPr>
+        <w:spacing w:after="0"/>
+        <w:jc w:val="both"/>
+        <w:rPr>
+          <w:rFonts w:ascii="Arial" w:hAnsi="Arial" w:cs="Arial"/>
+          <w:sz w:val="26"/>
+          <w:szCs w:val="26"/>
+        </w:rPr>
+      </w:pPr>
+      <w:r>
+        <w:rPr>
+          <w:rFonts w:ascii="Arial" w:hAnsi="Arial" w:cs="Arial"/>
+          <w:b/>
+          <w:bCs/>
+          <w:sz w:val="26"/>
+          <w:szCs w:val="26"/>
+        </w:rPr>
         <w:lastRenderedPageBreak/>
-        <w:t xml:space="preserve">PERSPECTIVA DE </w:t>
-      </w:r>
-      <w:r>
-        <w:rPr>
-          <w:rFonts w:ascii="Arial" w:hAnsi="Arial" w:cs="Arial"/>
-          <w:b/>
-          <w:bCs/>
-          <w:sz w:val="26"/>
-          <w:szCs w:val="26"/>
-        </w:rPr>
-        <w:t>ADMINISTRADOR</w:t>
-      </w:r>
-      <w:r>
-        <w:rPr>
-          <w:rFonts w:ascii="Arial" w:hAnsi="Arial" w:cs="Arial"/>
-          <w:b/>
-          <w:bCs/>
-          <w:sz w:val="26"/>
-          <w:szCs w:val="26"/>
-        </w:rPr>
-        <w:t>:</w:t>
-      </w:r>
-    </w:p>
-    <w:p>
-      <w:pPr>
-        <w:spacing w:after="0"/>
-        <w:jc w:val="both"/>
-        <w:rPr>
-          <w:rFonts w:ascii="Arial" w:hAnsi="Arial" w:cs="Arial"/>
-          <w:b/>
-          <w:bCs/>
-          <w:sz w:val="26"/>
-          <w:szCs w:val="26"/>
-        </w:rPr>
-      </w:pPr>
-    </w:p>
-    <w:p>
-      <w:pPr>
-        <w:spacing w:after="0"/>
-        <w:jc w:val="both"/>
-        <w:rPr>
-          <w:rFonts w:ascii="Arial" w:hAnsi="Arial" w:cs="Arial"/>
-          <w:sz w:val="26"/>
-          <w:szCs w:val="26"/>
-        </w:rPr>
-      </w:pPr>
-      <w:r>
-        <w:rPr>
-          <w:rFonts w:ascii="Arial" w:hAnsi="Arial" w:cs="Arial"/>
-          <w:b/>
-          <w:bCs/>
-          <w:sz w:val="26"/>
-          <w:szCs w:val="26"/>
-        </w:rPr>
         <w:t xml:space="preserve">Como </w:t>
       </w:r>
       <w:r>
@@ -1280,6 +2146,114 @@
           <w:sz w:val="26"/>
           <w:szCs w:val="26"/>
         </w:rPr>
+        <w:t>administrador,</w:t>
+      </w:r>
+    </w:p>
+    <w:p>
+      <w:pPr>
+        <w:spacing w:after="0"/>
+        <w:jc w:val="both"/>
+        <w:rPr>
+          <w:rFonts w:ascii="Arial" w:hAnsi="Arial" w:cs="Arial"/>
+          <w:sz w:val="26"/>
+          <w:szCs w:val="26"/>
+        </w:rPr>
+      </w:pPr>
+      <w:r>
+        <w:rPr>
+          <w:rFonts w:ascii="Arial" w:hAnsi="Arial" w:cs="Arial"/>
+          <w:b/>
+          <w:bCs/>
+          <w:sz w:val="26"/>
+          <w:szCs w:val="26"/>
+        </w:rPr>
+        <w:t>Quiero</w:t>
+      </w:r>
+      <w:r>
+        <w:rPr>
+          <w:rFonts w:ascii="Arial" w:hAnsi="Arial" w:cs="Arial"/>
+          <w:b/>
+          <w:bCs/>
+          <w:sz w:val="26"/>
+          <w:szCs w:val="26"/>
+        </w:rPr>
+        <w:t xml:space="preserve"> </w:t>
+      </w:r>
+      <w:r>
+        <w:rPr>
+          <w:rFonts w:ascii="Arial" w:hAnsi="Arial" w:cs="Arial"/>
+          <w:sz w:val="26"/>
+          <w:szCs w:val="26"/>
+        </w:rPr>
+        <w:t>colocar criterios en reportes,</w:t>
+      </w:r>
+    </w:p>
+    <w:p>
+      <w:pPr>
+        <w:spacing w:after="0"/>
+        <w:jc w:val="both"/>
+        <w:rPr>
+          <w:rFonts w:ascii="Arial" w:hAnsi="Arial" w:cs="Arial"/>
+          <w:sz w:val="26"/>
+          <w:szCs w:val="26"/>
+        </w:rPr>
+      </w:pPr>
+      <w:r>
+        <w:rPr>
+          <w:rFonts w:ascii="Arial" w:hAnsi="Arial" w:cs="Arial"/>
+          <w:b/>
+          <w:bCs/>
+          <w:sz w:val="26"/>
+          <w:szCs w:val="26"/>
+        </w:rPr>
+        <w:t xml:space="preserve">Para </w:t>
+      </w:r>
+      <w:r>
+        <w:rPr>
+          <w:rFonts w:ascii="Arial" w:hAnsi="Arial" w:cs="Arial"/>
+          <w:sz w:val="26"/>
+          <w:szCs w:val="26"/>
+        </w:rPr>
+        <w:t>generar reportes con condiciones o requisitos que establecí.</w:t>
+      </w:r>
+    </w:p>
+    <w:p>
+      <w:pPr>
+        <w:spacing w:after="0"/>
+        <w:jc w:val="both"/>
+        <w:rPr>
+          <w:rFonts w:ascii="Arial" w:hAnsi="Arial" w:cs="Arial"/>
+          <w:sz w:val="26"/>
+          <w:szCs w:val="26"/>
+        </w:rPr>
+      </w:pPr>
+    </w:p>
+    <w:p>
+      <w:pPr>
+        <w:spacing w:after="0"/>
+        <w:jc w:val="both"/>
+        <w:rPr>
+          <w:rFonts w:ascii="Arial" w:hAnsi="Arial" w:cs="Arial"/>
+          <w:sz w:val="26"/>
+          <w:szCs w:val="26"/>
+        </w:rPr>
+      </w:pPr>
+      <w:r>
+        <w:rPr>
+          <w:rFonts w:ascii="Arial" w:hAnsi="Arial" w:cs="Arial"/>
+          <w:b/>
+          <w:bCs/>
+          <w:sz w:val="26"/>
+          <w:szCs w:val="26"/>
+        </w:rPr>
+        <w:t xml:space="preserve">Como </w:t>
+      </w:r>
+      <w:r>
+        <w:rPr>
+          <w:rFonts w:ascii="Arial" w:hAnsi="Arial" w:cs="Arial"/>
+          <w:sz w:val="26"/>
+          <w:szCs w:val="26"/>
+        </w:rPr>
         <w:t>administrador</w:t>
       </w:r>
       <w:r>
@@ -1317,31 +2291,15 @@
           <w:sz w:val="26"/>
           <w:szCs w:val="26"/>
         </w:rPr>
-        <w:t>registrar</w:t>
-      </w:r>
-      <w:r>
-        <w:rPr>
-          <w:rFonts w:ascii="Arial" w:hAnsi="Arial" w:cs="Arial"/>
-          <w:sz w:val="26"/>
-          <w:szCs w:val="26"/>
-        </w:rPr>
-        <w:t>, actualizar o eliminar datos de servicios ofrecidos</w:t>
-      </w:r>
-      <w:r>
-        <w:rPr>
-          <w:rFonts w:ascii="Arial" w:hAnsi="Arial" w:cs="Arial"/>
-          <w:sz w:val="26"/>
-          <w:szCs w:val="26"/>
-        </w:rPr>
-        <w:t>,</w:t>
-      </w:r>
-      <w:r>
-        <w:rPr>
-          <w:rFonts w:ascii="Arial" w:hAnsi="Arial" w:cs="Arial"/>
-          <w:sz w:val="26"/>
-          <w:szCs w:val="26"/>
-        </w:rPr>
-        <w:t xml:space="preserve"> papelería, ropa, horarios e información general del negocio,</w:t>
+        <w:t xml:space="preserve">listar, actualizar o </w:t>
+      </w:r>
+      <w:r>
+        <w:rPr>
+          <w:rFonts w:ascii="Arial" w:hAnsi="Arial" w:cs="Arial"/>
+          <w:sz w:val="26"/>
+          <w:szCs w:val="26"/>
+        </w:rPr>
+        <w:t>eliminar facturas electrónicas de servicios (Impresiones, copias, transcripciones, escáner, etc.)</w:t>
       </w:r>
     </w:p>
     <w:p>
@@ -1370,294 +2328,11 @@
           <w:sz w:val="26"/>
           <w:szCs w:val="26"/>
         </w:rPr>
-        <w:t>enriquecer el sistema con la información vigente del negocio.</w:t>
-      </w:r>
-    </w:p>
-    <w:p>
-      <w:pPr>
-        <w:spacing w:after="0"/>
-        <w:jc w:val="both"/>
-        <w:rPr>
-          <w:rFonts w:ascii="Arial" w:hAnsi="Arial" w:cs="Arial"/>
-          <w:sz w:val="26"/>
-          <w:szCs w:val="26"/>
-        </w:rPr>
-      </w:pPr>
-    </w:p>
-    <w:p>
-      <w:pPr>
-        <w:spacing w:after="0"/>
-        <w:jc w:val="both"/>
-        <w:rPr>
-          <w:rFonts w:ascii="Arial" w:hAnsi="Arial" w:cs="Arial"/>
-          <w:sz w:val="26"/>
-          <w:szCs w:val="26"/>
-        </w:rPr>
-      </w:pPr>
-      <w:r>
-        <w:rPr>
-          <w:rFonts w:ascii="Arial" w:hAnsi="Arial" w:cs="Arial"/>
-          <w:b/>
-          <w:bCs/>
-          <w:sz w:val="26"/>
-          <w:szCs w:val="26"/>
-        </w:rPr>
-        <w:t xml:space="preserve">Como </w:t>
-      </w:r>
-      <w:r>
-        <w:rPr>
-          <w:rFonts w:ascii="Arial" w:hAnsi="Arial" w:cs="Arial"/>
-          <w:sz w:val="26"/>
-          <w:szCs w:val="26"/>
-        </w:rPr>
-        <w:t>administrador,</w:t>
-      </w:r>
-    </w:p>
-    <w:p>
-      <w:pPr>
-        <w:spacing w:after="0"/>
-        <w:jc w:val="both"/>
-        <w:rPr>
-          <w:rFonts w:ascii="Arial" w:hAnsi="Arial" w:cs="Arial"/>
-          <w:sz w:val="26"/>
-          <w:szCs w:val="26"/>
-        </w:rPr>
-      </w:pPr>
-      <w:r>
-        <w:rPr>
-          <w:rFonts w:ascii="Arial" w:hAnsi="Arial" w:cs="Arial"/>
-          <w:b/>
-          <w:bCs/>
-          <w:sz w:val="26"/>
-          <w:szCs w:val="26"/>
-        </w:rPr>
-        <w:t xml:space="preserve">Quiero </w:t>
-      </w:r>
-      <w:r>
-        <w:rPr>
-          <w:rFonts w:ascii="Arial" w:hAnsi="Arial" w:cs="Arial"/>
-          <w:sz w:val="26"/>
-          <w:szCs w:val="26"/>
-        </w:rPr>
-        <w:t xml:space="preserve">registrar, actualizar o eliminar datos </w:t>
-      </w:r>
-      <w:r>
-        <w:rPr>
-          <w:rFonts w:ascii="Arial" w:hAnsi="Arial" w:cs="Arial"/>
-          <w:sz w:val="26"/>
-          <w:szCs w:val="26"/>
-        </w:rPr>
-        <w:t>personales de operadores de cibercafé o míos,</w:t>
-      </w:r>
-    </w:p>
-    <w:p>
-      <w:pPr>
-        <w:spacing w:after="0"/>
-        <w:jc w:val="both"/>
-        <w:rPr>
-          <w:rFonts w:ascii="Arial" w:hAnsi="Arial" w:cs="Arial"/>
-          <w:sz w:val="26"/>
-          <w:szCs w:val="26"/>
-        </w:rPr>
-      </w:pPr>
-      <w:r>
-        <w:rPr>
-          <w:rFonts w:ascii="Arial" w:hAnsi="Arial" w:cs="Arial"/>
-          <w:b/>
-          <w:bCs/>
-          <w:sz w:val="26"/>
-          <w:szCs w:val="26"/>
-        </w:rPr>
-        <w:t xml:space="preserve">Para </w:t>
-      </w:r>
-      <w:r>
-        <w:rPr>
-          <w:rFonts w:ascii="Arial" w:hAnsi="Arial" w:cs="Arial"/>
-          <w:sz w:val="26"/>
-          <w:szCs w:val="26"/>
-        </w:rPr>
-        <w:t>agregar operadores de cibercafé, ya que solo hay un solo administrador; y modificar datos necesarios.</w:t>
-      </w:r>
-    </w:p>
-    <w:p>
-      <w:pPr>
-        <w:spacing w:after="0"/>
-        <w:jc w:val="both"/>
-        <w:rPr>
-          <w:rFonts w:ascii="Arial" w:hAnsi="Arial" w:cs="Arial"/>
-          <w:sz w:val="26"/>
-          <w:szCs w:val="26"/>
-        </w:rPr>
-      </w:pPr>
-    </w:p>
-    <w:p>
-      <w:pPr>
-        <w:spacing w:after="0"/>
-        <w:jc w:val="both"/>
-        <w:rPr>
-          <w:rFonts w:ascii="Arial" w:hAnsi="Arial" w:cs="Arial"/>
-          <w:sz w:val="26"/>
-          <w:szCs w:val="26"/>
-        </w:rPr>
-      </w:pPr>
-      <w:r>
-        <w:rPr>
-          <w:rFonts w:ascii="Arial" w:hAnsi="Arial" w:cs="Arial"/>
-          <w:b/>
-          <w:bCs/>
-          <w:sz w:val="26"/>
-          <w:szCs w:val="26"/>
-        </w:rPr>
-        <w:t xml:space="preserve">Como </w:t>
-      </w:r>
-      <w:r>
-        <w:rPr>
-          <w:rFonts w:ascii="Arial" w:hAnsi="Arial" w:cs="Arial"/>
-          <w:sz w:val="26"/>
-          <w:szCs w:val="26"/>
-        </w:rPr>
-        <w:t>administrador,</w:t>
-      </w:r>
-    </w:p>
-    <w:p>
-      <w:pPr>
-        <w:spacing w:after="0"/>
-        <w:jc w:val="both"/>
-        <w:rPr>
-          <w:rFonts w:ascii="Arial" w:hAnsi="Arial" w:cs="Arial"/>
-          <w:sz w:val="26"/>
-          <w:szCs w:val="26"/>
-        </w:rPr>
-      </w:pPr>
-      <w:r>
-        <w:rPr>
-          <w:rFonts w:ascii="Arial" w:hAnsi="Arial" w:cs="Arial"/>
-          <w:b/>
-          <w:bCs/>
-          <w:sz w:val="26"/>
-          <w:szCs w:val="26"/>
-        </w:rPr>
-        <w:t xml:space="preserve">Quiero </w:t>
-      </w:r>
-      <w:r>
-        <w:rPr>
-          <w:rFonts w:ascii="Arial" w:hAnsi="Arial" w:cs="Arial"/>
-          <w:sz w:val="26"/>
-          <w:szCs w:val="26"/>
-        </w:rPr>
-        <w:t>generar reportes generales del negocio</w:t>
-      </w:r>
-      <w:r>
-        <w:rPr>
-          <w:rFonts w:ascii="Arial" w:hAnsi="Arial" w:cs="Arial"/>
-          <w:sz w:val="26"/>
-          <w:szCs w:val="26"/>
-        </w:rPr>
-        <w:t>,</w:t>
-      </w:r>
-      <w:r>
-        <w:rPr>
-          <w:rFonts w:ascii="Arial" w:hAnsi="Arial" w:cs="Arial"/>
-          <w:sz w:val="26"/>
-          <w:szCs w:val="26"/>
-        </w:rPr>
-        <w:t xml:space="preserve"> papelería o servicios ofrecidos,</w:t>
-      </w:r>
-    </w:p>
-    <w:p>
-      <w:pPr>
-        <w:spacing w:after="0"/>
-        <w:jc w:val="both"/>
-        <w:rPr>
-          <w:rFonts w:ascii="Arial" w:hAnsi="Arial" w:cs="Arial"/>
-          <w:sz w:val="26"/>
-          <w:szCs w:val="26"/>
-        </w:rPr>
-      </w:pPr>
-      <w:r>
-        <w:rPr>
-          <w:rFonts w:ascii="Arial" w:hAnsi="Arial" w:cs="Arial"/>
-          <w:b/>
-          <w:bCs/>
-          <w:sz w:val="26"/>
-          <w:szCs w:val="26"/>
-        </w:rPr>
-        <w:t xml:space="preserve">Para </w:t>
-      </w:r>
-      <w:r>
-        <w:rPr>
-          <w:rFonts w:ascii="Arial" w:hAnsi="Arial" w:cs="Arial"/>
-          <w:sz w:val="26"/>
-          <w:szCs w:val="26"/>
-        </w:rPr>
-        <w:t>tener conocimiento de cómo está mi negocio en movimientos y ver las estadísticas.</w:t>
-      </w:r>
-    </w:p>
-    <w:p>
-      <w:pPr>
-        <w:spacing w:after="0"/>
-        <w:jc w:val="both"/>
-        <w:rPr>
-          <w:rFonts w:ascii="Arial" w:hAnsi="Arial" w:cs="Arial"/>
-          <w:sz w:val="26"/>
-          <w:szCs w:val="26"/>
-        </w:rPr>
-      </w:pPr>
-    </w:p>
-    <w:p>
-      <w:pPr>
-        <w:spacing w:after="0"/>
-        <w:jc w:val="both"/>
-        <w:rPr>
-          <w:rFonts w:ascii="Arial" w:hAnsi="Arial" w:cs="Arial"/>
-          <w:sz w:val="26"/>
-          <w:szCs w:val="26"/>
-        </w:rPr>
-      </w:pPr>
-      <w:r>
-        <w:rPr>
-          <w:rFonts w:ascii="Arial" w:hAnsi="Arial" w:cs="Arial"/>
-          <w:b/>
-          <w:bCs/>
-          <w:sz w:val="26"/>
-          <w:szCs w:val="26"/>
-        </w:rPr>
-        <w:t xml:space="preserve">Como </w:t>
-      </w:r>
-      <w:r>
-        <w:rPr>
-          <w:rFonts w:ascii="Arial" w:hAnsi="Arial" w:cs="Arial"/>
-          <w:sz w:val="26"/>
-          <w:szCs w:val="26"/>
-        </w:rPr>
-        <w:t>administrador,</w:t>
-      </w:r>
-    </w:p>
-    <w:p>
-      <w:pPr>
-        <w:spacing w:after="0"/>
-        <w:jc w:val="both"/>
-        <w:rPr>
-          <w:rFonts w:ascii="Arial" w:hAnsi="Arial" w:cs="Arial"/>
-          <w:sz w:val="26"/>
-          <w:szCs w:val="26"/>
-        </w:rPr>
-      </w:pPr>
-      <w:r>
-        <w:rPr>
-          <w:rFonts w:ascii="Arial" w:hAnsi="Arial" w:cs="Arial"/>
-          <w:b/>
-          <w:bCs/>
-          <w:sz w:val="26"/>
-          <w:szCs w:val="26"/>
-        </w:rPr>
-        <w:t>Quiero</w:t>
-      </w:r>
-      <w:r>
-        <w:rPr>
-          <w:rFonts w:ascii="Arial" w:hAnsi="Arial" w:cs="Arial"/>
-          <w:b/>
-          <w:bCs/>
+        <w:t>manejar</w:t>
+      </w:r>
+      <w:r>
+        <w:rPr>
+          <w:rFonts w:ascii="Arial" w:hAnsi="Arial" w:cs="Arial"/>
           <w:sz w:val="26"/>
           <w:szCs w:val="26"/>
         </w:rPr>
@@ -1669,351 +2344,24 @@
           <w:sz w:val="26"/>
           <w:szCs w:val="26"/>
         </w:rPr>
-        <w:t>obtener cálculos de ingresos generado en papelería o servicios</w:t>
-      </w:r>
-      <w:r>
-        <w:rPr>
-          <w:rFonts w:ascii="Arial" w:hAnsi="Arial" w:cs="Arial"/>
-          <w:sz w:val="26"/>
-          <w:szCs w:val="26"/>
-        </w:rPr>
-        <w:t>,</w:t>
-      </w:r>
-    </w:p>
-    <w:p>
-      <w:pPr>
-        <w:spacing w:after="0"/>
-        <w:jc w:val="both"/>
-        <w:rPr>
-          <w:rFonts w:ascii="Arial" w:hAnsi="Arial" w:cs="Arial"/>
-          <w:sz w:val="26"/>
-          <w:szCs w:val="26"/>
-        </w:rPr>
-      </w:pPr>
-      <w:r>
-        <w:rPr>
-          <w:rFonts w:ascii="Arial" w:hAnsi="Arial" w:cs="Arial"/>
-          <w:b/>
-          <w:bCs/>
-          <w:sz w:val="26"/>
-          <w:szCs w:val="26"/>
-        </w:rPr>
-        <w:t xml:space="preserve">Para </w:t>
-      </w:r>
-      <w:r>
-        <w:rPr>
-          <w:rFonts w:ascii="Arial" w:hAnsi="Arial" w:cs="Arial"/>
-          <w:sz w:val="26"/>
-          <w:szCs w:val="26"/>
-        </w:rPr>
-        <w:t>saber si estoy teniendo ganancias, pérdidas o estoy en punto de equilibrio</w:t>
-      </w:r>
-      <w:r>
-        <w:rPr>
-          <w:rFonts w:ascii="Arial" w:hAnsi="Arial" w:cs="Arial"/>
-          <w:sz w:val="26"/>
-          <w:szCs w:val="26"/>
-        </w:rPr>
-        <w:t>.</w:t>
-      </w:r>
-    </w:p>
-    <w:p>
-      <w:pPr>
-        <w:spacing w:after="0"/>
-        <w:jc w:val="both"/>
-        <w:rPr>
-          <w:rFonts w:ascii="Arial" w:hAnsi="Arial" w:cs="Arial"/>
-          <w:sz w:val="26"/>
-          <w:szCs w:val="26"/>
-        </w:rPr>
-      </w:pPr>
-    </w:p>
-    <w:p>
-      <w:pPr>
-        <w:spacing w:after="0"/>
-        <w:jc w:val="both"/>
-        <w:rPr>
-          <w:rFonts w:ascii="Arial" w:hAnsi="Arial" w:cs="Arial"/>
-          <w:sz w:val="26"/>
-          <w:szCs w:val="26"/>
-        </w:rPr>
-      </w:pPr>
-      <w:r>
-        <w:rPr>
-          <w:rFonts w:ascii="Arial" w:hAnsi="Arial" w:cs="Arial"/>
-          <w:b/>
-          <w:bCs/>
-          <w:sz w:val="26"/>
-          <w:szCs w:val="26"/>
-        </w:rPr>
-        <w:t xml:space="preserve">Como </w:t>
-      </w:r>
-      <w:r>
-        <w:rPr>
-          <w:rFonts w:ascii="Arial" w:hAnsi="Arial" w:cs="Arial"/>
-          <w:sz w:val="26"/>
-          <w:szCs w:val="26"/>
-        </w:rPr>
-        <w:t>administrador,</w:t>
-      </w:r>
-    </w:p>
-    <w:p>
-      <w:pPr>
-        <w:spacing w:after="0"/>
-        <w:jc w:val="both"/>
-        <w:rPr>
-          <w:rFonts w:ascii="Arial" w:hAnsi="Arial" w:cs="Arial"/>
-          <w:sz w:val="26"/>
-          <w:szCs w:val="26"/>
-        </w:rPr>
-      </w:pPr>
-      <w:r>
-        <w:rPr>
-          <w:rFonts w:ascii="Arial" w:hAnsi="Arial" w:cs="Arial"/>
-          <w:b/>
-          <w:bCs/>
-          <w:sz w:val="26"/>
-          <w:szCs w:val="26"/>
-        </w:rPr>
-        <w:t>Quiero</w:t>
-      </w:r>
-      <w:r>
-        <w:rPr>
-          <w:rFonts w:ascii="Arial" w:hAnsi="Arial" w:cs="Arial"/>
-          <w:b/>
-          <w:bCs/>
-          <w:sz w:val="26"/>
-          <w:szCs w:val="26"/>
-        </w:rPr>
-        <w:t xml:space="preserve"> </w:t>
-      </w:r>
-      <w:r>
-        <w:rPr>
-          <w:rFonts w:ascii="Arial" w:hAnsi="Arial" w:cs="Arial"/>
-          <w:sz w:val="26"/>
-          <w:szCs w:val="26"/>
-        </w:rPr>
-        <w:t>tener estadísticas cuantitativas y cualitativas sin tener que generar reportes</w:t>
-      </w:r>
-      <w:r>
-        <w:rPr>
-          <w:rFonts w:ascii="Arial" w:hAnsi="Arial" w:cs="Arial"/>
-          <w:sz w:val="26"/>
-          <w:szCs w:val="26"/>
-        </w:rPr>
-        <w:t>,</w:t>
-      </w:r>
-    </w:p>
-    <w:p>
-      <w:pPr>
-        <w:spacing w:after="0"/>
-        <w:jc w:val="both"/>
-        <w:rPr>
-          <w:rFonts w:ascii="Arial" w:hAnsi="Arial" w:cs="Arial"/>
-          <w:sz w:val="26"/>
-          <w:szCs w:val="26"/>
-        </w:rPr>
-      </w:pPr>
-      <w:r>
-        <w:rPr>
-          <w:rFonts w:ascii="Arial" w:hAnsi="Arial" w:cs="Arial"/>
-          <w:b/>
-          <w:bCs/>
-          <w:sz w:val="26"/>
-          <w:szCs w:val="26"/>
-        </w:rPr>
-        <w:t xml:space="preserve">Para </w:t>
-      </w:r>
-      <w:r>
-        <w:rPr>
-          <w:rFonts w:ascii="Arial" w:hAnsi="Arial" w:cs="Arial"/>
-          <w:sz w:val="26"/>
-          <w:szCs w:val="26"/>
-        </w:rPr>
-        <w:t>observar a simple vista información que necesito consultar.</w:t>
-      </w:r>
-    </w:p>
-    <w:p>
-      <w:pPr>
-        <w:spacing w:after="0"/>
-        <w:jc w:val="both"/>
-        <w:rPr>
-          <w:rFonts w:ascii="Arial" w:hAnsi="Arial" w:cs="Arial"/>
-          <w:sz w:val="26"/>
-          <w:szCs w:val="26"/>
-        </w:rPr>
-      </w:pPr>
-    </w:p>
-    <w:p>
-      <w:pPr>
-        <w:spacing w:after="0"/>
-        <w:jc w:val="both"/>
-        <w:rPr>
-          <w:rFonts w:ascii="Arial" w:hAnsi="Arial" w:cs="Arial"/>
-          <w:sz w:val="26"/>
-          <w:szCs w:val="26"/>
-        </w:rPr>
-      </w:pPr>
-      <w:r>
-        <w:rPr>
-          <w:rFonts w:ascii="Arial" w:hAnsi="Arial" w:cs="Arial"/>
-          <w:b/>
-          <w:bCs/>
-          <w:sz w:val="26"/>
-          <w:szCs w:val="26"/>
-        </w:rPr>
-        <w:t xml:space="preserve">Como </w:t>
-      </w:r>
-      <w:r>
-        <w:rPr>
-          <w:rFonts w:ascii="Arial" w:hAnsi="Arial" w:cs="Arial"/>
-          <w:sz w:val="26"/>
-          <w:szCs w:val="26"/>
-        </w:rPr>
-        <w:t>administrador,</w:t>
-      </w:r>
-    </w:p>
-    <w:p>
-      <w:pPr>
-        <w:spacing w:after="0"/>
-        <w:jc w:val="both"/>
-        <w:rPr>
-          <w:rFonts w:ascii="Arial" w:hAnsi="Arial" w:cs="Arial"/>
-          <w:sz w:val="26"/>
-          <w:szCs w:val="26"/>
-        </w:rPr>
-      </w:pPr>
-      <w:r>
-        <w:rPr>
-          <w:rFonts w:ascii="Arial" w:hAnsi="Arial" w:cs="Arial"/>
-          <w:b/>
-          <w:bCs/>
-          <w:sz w:val="26"/>
-          <w:szCs w:val="26"/>
-        </w:rPr>
-        <w:t>Quiero</w:t>
-      </w:r>
-      <w:r>
-        <w:rPr>
-          <w:rFonts w:ascii="Arial" w:hAnsi="Arial" w:cs="Arial"/>
-          <w:b/>
-          <w:bCs/>
-          <w:sz w:val="26"/>
-          <w:szCs w:val="26"/>
-        </w:rPr>
-        <w:t xml:space="preserve"> </w:t>
-      </w:r>
-      <w:r>
-        <w:rPr>
-          <w:rFonts w:ascii="Arial" w:hAnsi="Arial" w:cs="Arial"/>
-          <w:sz w:val="26"/>
-          <w:szCs w:val="26"/>
-        </w:rPr>
-        <w:t>colocar criterios en reportes</w:t>
-      </w:r>
-      <w:r>
-        <w:rPr>
-          <w:rFonts w:ascii="Arial" w:hAnsi="Arial" w:cs="Arial"/>
-          <w:sz w:val="26"/>
-          <w:szCs w:val="26"/>
-        </w:rPr>
-        <w:t>,</w:t>
-      </w:r>
-    </w:p>
-    <w:p>
-      <w:pPr>
-        <w:spacing w:after="0"/>
-        <w:jc w:val="both"/>
-        <w:rPr>
-          <w:rFonts w:ascii="Arial" w:hAnsi="Arial" w:cs="Arial"/>
-          <w:sz w:val="26"/>
-          <w:szCs w:val="26"/>
-        </w:rPr>
-      </w:pPr>
-      <w:r>
-        <w:rPr>
-          <w:rFonts w:ascii="Arial" w:hAnsi="Arial" w:cs="Arial"/>
-          <w:b/>
-          <w:bCs/>
-          <w:sz w:val="26"/>
-          <w:szCs w:val="26"/>
-        </w:rPr>
-        <w:t xml:space="preserve">Para </w:t>
-      </w:r>
-      <w:r>
-        <w:rPr>
-          <w:rFonts w:ascii="Arial" w:hAnsi="Arial" w:cs="Arial"/>
-          <w:sz w:val="26"/>
-          <w:szCs w:val="26"/>
-        </w:rPr>
-        <w:t>generar reportes con condiciones o requisitos que establecí.</w:t>
-      </w:r>
-    </w:p>
-    <w:p>
-      <w:pPr>
-        <w:spacing w:after="0"/>
-        <w:jc w:val="both"/>
-        <w:rPr>
-          <w:rFonts w:ascii="Arial" w:hAnsi="Arial" w:cs="Arial"/>
-          <w:sz w:val="26"/>
-          <w:szCs w:val="26"/>
-        </w:rPr>
-      </w:pPr>
-    </w:p>
-    <w:p>
-      <w:pPr>
-        <w:spacing w:after="0"/>
-        <w:jc w:val="both"/>
-        <w:rPr>
-          <w:rFonts w:ascii="Arial" w:hAnsi="Arial" w:cs="Arial"/>
-          <w:sz w:val="26"/>
-          <w:szCs w:val="26"/>
-        </w:rPr>
-      </w:pPr>
-    </w:p>
-    <w:p>
-      <w:pPr>
-        <w:spacing w:after="0"/>
-        <w:jc w:val="both"/>
-        <w:rPr>
-          <w:rFonts w:ascii="Arial" w:hAnsi="Arial" w:cs="Arial"/>
-          <w:sz w:val="26"/>
-          <w:szCs w:val="26"/>
-        </w:rPr>
-      </w:pPr>
-    </w:p>
-    <w:p>
-      <w:pPr>
-        <w:spacing w:after="0"/>
-        <w:jc w:val="both"/>
-        <w:rPr>
-          <w:rFonts w:ascii="Arial" w:hAnsi="Arial" w:cs="Arial"/>
-          <w:sz w:val="26"/>
-          <w:szCs w:val="26"/>
-        </w:rPr>
-      </w:pPr>
-    </w:p>
-    <w:p>
-      <w:pPr>
-        <w:spacing w:after="0"/>
-        <w:jc w:val="both"/>
-        <w:rPr>
-          <w:rFonts w:ascii="Arial" w:hAnsi="Arial" w:cs="Arial"/>
-          <w:sz w:val="26"/>
-          <w:szCs w:val="26"/>
-        </w:rPr>
-      </w:pPr>
-    </w:p>
-    <w:p>
-      <w:pPr>
-        <w:spacing w:after="0"/>
-        <w:jc w:val="both"/>
-        <w:rPr>
-          <w:rFonts w:ascii="Arial" w:hAnsi="Arial" w:cs="Arial"/>
-          <w:sz w:val="26"/>
-          <w:szCs w:val="26"/>
-        </w:rPr>
-      </w:pPr>
+        <w:t>las</w:t>
+      </w:r>
+      <w:r>
+        <w:rPr>
+          <w:rFonts w:ascii="Arial" w:hAnsi="Arial" w:cs="Arial"/>
+          <w:sz w:val="26"/>
+          <w:szCs w:val="26"/>
+        </w:rPr>
+        <w:t xml:space="preserve"> factura</w:t>
+      </w:r>
+      <w:r>
+        <w:rPr>
+          <w:rFonts w:ascii="Arial" w:hAnsi="Arial" w:cs="Arial"/>
+          <w:sz w:val="26"/>
+          <w:szCs w:val="26"/>
+        </w:rPr>
+        <w:t>s.</w:t>
+      </w:r>
     </w:p>
     <w:p>
       <w:pPr>
@@ -2062,7 +2410,6 @@
           <w:sz w:val="26"/>
           <w:szCs w:val="26"/>
         </w:rPr>
-        <w:lastRenderedPageBreak/>
         <w:t xml:space="preserve">PERSPECTIVA DE </w:t>
       </w:r>
       <w:r>
@@ -2252,15 +2599,7 @@
           <w:sz w:val="26"/>
           <w:szCs w:val="26"/>
         </w:rPr>
-        <w:t>encontrar y reportar errores detectados</w:t>
-      </w:r>
-      <w:r>
-        <w:rPr>
-          <w:rFonts w:ascii="Arial" w:hAnsi="Arial" w:cs="Arial"/>
-          <w:sz w:val="26"/>
-          <w:szCs w:val="26"/>
-        </w:rPr>
-        <w:t xml:space="preserve">, </w:t>
+        <w:t xml:space="preserve">encontrar y reportar errores detectados, </w:t>
       </w:r>
     </w:p>
     <w:p>
@@ -2289,15 +2628,7 @@
           <w:sz w:val="26"/>
           <w:szCs w:val="26"/>
         </w:rPr>
-        <w:t>informar al desarrollador que realice las respectivas correcciones</w:t>
-      </w:r>
-      <w:r>
-        <w:rPr>
-          <w:rFonts w:ascii="Arial" w:hAnsi="Arial" w:cs="Arial"/>
-          <w:sz w:val="26"/>
-          <w:szCs w:val="26"/>
-        </w:rPr>
-        <w:t>.</w:t>
+        <w:t>informar al desarrollador que realice las respectivas correcciones.</w:t>
       </w:r>
     </w:p>
     <w:p>
@@ -2366,15 +2697,7 @@
           <w:sz w:val="26"/>
           <w:szCs w:val="26"/>
         </w:rPr>
-        <w:t>dar observaciones</w:t>
-      </w:r>
-      <w:r>
-        <w:rPr>
-          <w:rFonts w:ascii="Arial" w:hAnsi="Arial" w:cs="Arial"/>
-          <w:sz w:val="26"/>
-          <w:szCs w:val="26"/>
-        </w:rPr>
-        <w:t xml:space="preserve">, </w:t>
+        <w:t xml:space="preserve">dar observaciones, </w:t>
       </w:r>
     </w:p>
     <w:p>
@@ -2403,206 +2726,103 @@
           <w:sz w:val="26"/>
           <w:szCs w:val="26"/>
         </w:rPr>
-        <w:t>que el desarrollador las tome en cuenta</w:t>
-      </w:r>
-      <w:r>
-        <w:rPr>
-          <w:rFonts w:ascii="Arial" w:hAnsi="Arial" w:cs="Arial"/>
-          <w:sz w:val="26"/>
-          <w:szCs w:val="26"/>
-        </w:rPr>
-        <w:t>.</w:t>
-      </w:r>
-    </w:p>
-    <w:p>
-      <w:pPr>
-        <w:spacing w:after="0"/>
-        <w:jc w:val="both"/>
-        <w:rPr>
-          <w:rFonts w:ascii="Arial" w:hAnsi="Arial" w:cs="Arial"/>
-          <w:sz w:val="26"/>
-          <w:szCs w:val="26"/>
-        </w:rPr>
-      </w:pPr>
-    </w:p>
-    <w:p>
-      <w:pPr>
-        <w:spacing w:after="0"/>
-        <w:jc w:val="both"/>
-        <w:rPr>
-          <w:rFonts w:ascii="Arial" w:hAnsi="Arial" w:cs="Arial"/>
-          <w:sz w:val="26"/>
-          <w:szCs w:val="26"/>
-        </w:rPr>
-      </w:pPr>
-    </w:p>
-    <w:p>
-      <w:pPr>
-        <w:spacing w:after="0"/>
-        <w:jc w:val="both"/>
-        <w:rPr>
-          <w:rFonts w:ascii="Arial" w:hAnsi="Arial" w:cs="Arial"/>
-          <w:sz w:val="26"/>
-          <w:szCs w:val="26"/>
-        </w:rPr>
-      </w:pPr>
-    </w:p>
-    <w:p>
-      <w:pPr>
-        <w:spacing w:after="0"/>
-        <w:jc w:val="both"/>
-        <w:rPr>
-          <w:rFonts w:ascii="Arial" w:hAnsi="Arial" w:cs="Arial"/>
-          <w:sz w:val="26"/>
-          <w:szCs w:val="26"/>
-        </w:rPr>
-      </w:pPr>
-    </w:p>
-    <w:p>
-      <w:pPr>
-        <w:spacing w:after="0"/>
-        <w:jc w:val="both"/>
-        <w:rPr>
-          <w:rFonts w:ascii="Arial" w:hAnsi="Arial" w:cs="Arial"/>
-          <w:sz w:val="26"/>
-          <w:szCs w:val="26"/>
-        </w:rPr>
-      </w:pPr>
-    </w:p>
-    <w:p>
-      <w:pPr>
-        <w:spacing w:after="0"/>
-        <w:jc w:val="both"/>
-        <w:rPr>
-          <w:rFonts w:ascii="Arial" w:hAnsi="Arial" w:cs="Arial"/>
-          <w:sz w:val="26"/>
-          <w:szCs w:val="26"/>
-        </w:rPr>
-      </w:pPr>
-    </w:p>
-    <w:p>
-      <w:pPr>
-        <w:spacing w:after="0"/>
-        <w:jc w:val="both"/>
-        <w:rPr>
-          <w:rFonts w:ascii="Arial" w:hAnsi="Arial" w:cs="Arial"/>
-          <w:sz w:val="26"/>
-          <w:szCs w:val="26"/>
-        </w:rPr>
-      </w:pPr>
-    </w:p>
-    <w:p>
-      <w:pPr>
-        <w:spacing w:after="0"/>
-        <w:jc w:val="both"/>
-        <w:rPr>
-          <w:rFonts w:ascii="Arial" w:hAnsi="Arial" w:cs="Arial"/>
-          <w:sz w:val="26"/>
-          <w:szCs w:val="26"/>
-        </w:rPr>
-      </w:pPr>
-    </w:p>
-    <w:p>
-      <w:pPr>
-        <w:spacing w:after="0"/>
-        <w:jc w:val="both"/>
-        <w:rPr>
-          <w:rFonts w:ascii="Arial" w:hAnsi="Arial" w:cs="Arial"/>
-          <w:sz w:val="26"/>
-          <w:szCs w:val="26"/>
-        </w:rPr>
-      </w:pPr>
-    </w:p>
-    <w:p>
-      <w:pPr>
-        <w:spacing w:after="0"/>
-        <w:jc w:val="both"/>
-        <w:rPr>
-          <w:rFonts w:ascii="Arial" w:hAnsi="Arial" w:cs="Arial"/>
-          <w:sz w:val="26"/>
-          <w:szCs w:val="26"/>
-        </w:rPr>
-      </w:pPr>
-    </w:p>
-    <w:p>
-      <w:pPr>
-        <w:spacing w:after="0"/>
-        <w:jc w:val="both"/>
-        <w:rPr>
-          <w:rFonts w:ascii="Arial" w:hAnsi="Arial" w:cs="Arial"/>
-          <w:sz w:val="26"/>
-          <w:szCs w:val="26"/>
-        </w:rPr>
-      </w:pPr>
-    </w:p>
-    <w:p>
-      <w:pPr>
-        <w:spacing w:after="0"/>
-        <w:jc w:val="both"/>
-        <w:rPr>
-          <w:rFonts w:ascii="Arial" w:hAnsi="Arial" w:cs="Arial"/>
-          <w:sz w:val="26"/>
-          <w:szCs w:val="26"/>
-        </w:rPr>
-      </w:pPr>
-    </w:p>
-    <w:p>
-      <w:pPr>
-        <w:spacing w:after="0"/>
-        <w:jc w:val="both"/>
-        <w:rPr>
-          <w:rFonts w:ascii="Arial" w:hAnsi="Arial" w:cs="Arial"/>
-          <w:sz w:val="26"/>
-          <w:szCs w:val="26"/>
-        </w:rPr>
-      </w:pPr>
-    </w:p>
-    <w:p>
-      <w:pPr>
-        <w:spacing w:after="0"/>
-        <w:jc w:val="both"/>
-        <w:rPr>
-          <w:rFonts w:ascii="Arial" w:hAnsi="Arial" w:cs="Arial"/>
-          <w:sz w:val="26"/>
-          <w:szCs w:val="26"/>
-        </w:rPr>
-      </w:pPr>
-    </w:p>
-    <w:p>
-      <w:pPr>
-        <w:spacing w:after="0"/>
-        <w:jc w:val="both"/>
-        <w:rPr>
-          <w:rFonts w:ascii="Arial" w:hAnsi="Arial" w:cs="Arial"/>
-          <w:sz w:val="26"/>
-          <w:szCs w:val="26"/>
-        </w:rPr>
-      </w:pPr>
-      <w:bookmarkStart w:id="0" w:name="_GoBack"/>
-      <w:bookmarkEnd w:id="0"/>
-    </w:p>
-    <w:p>
-      <w:pPr>
-        <w:spacing w:after="0"/>
-        <w:jc w:val="both"/>
-        <w:rPr>
-          <w:rFonts w:ascii="Arial" w:hAnsi="Arial" w:cs="Arial"/>
-          <w:b/>
-          <w:bCs/>
-          <w:sz w:val="26"/>
-          <w:szCs w:val="26"/>
-        </w:rPr>
-      </w:pPr>
-    </w:p>
-    <w:p>
-      <w:pPr>
-        <w:pStyle w:val="Prrafodelista"/>
-        <w:spacing w:after="0"/>
-        <w:jc w:val="both"/>
-        <w:rPr>
-          <w:rFonts w:ascii="Arial" w:hAnsi="Arial" w:cs="Arial"/>
-          <w:b/>
-          <w:bCs/>
+        <w:t>que el desarrollador las tome en cuenta.</w:t>
+      </w:r>
+    </w:p>
+    <w:p>
+      <w:pPr>
+        <w:spacing w:after="0"/>
+        <w:jc w:val="both"/>
+        <w:rPr>
+          <w:rFonts w:ascii="Arial" w:hAnsi="Arial" w:cs="Arial"/>
+          <w:sz w:val="26"/>
+          <w:szCs w:val="26"/>
+        </w:rPr>
+      </w:pPr>
+    </w:p>
+    <w:p>
+      <w:pPr>
+        <w:spacing w:after="0"/>
+        <w:jc w:val="both"/>
+        <w:rPr>
+          <w:rFonts w:ascii="Arial" w:hAnsi="Arial" w:cs="Arial"/>
+          <w:sz w:val="26"/>
+          <w:szCs w:val="26"/>
+        </w:rPr>
+      </w:pPr>
+    </w:p>
+    <w:p>
+      <w:pPr>
+        <w:spacing w:after="0"/>
+        <w:jc w:val="both"/>
+        <w:rPr>
+          <w:rFonts w:ascii="Arial" w:hAnsi="Arial" w:cs="Arial"/>
+          <w:sz w:val="26"/>
+          <w:szCs w:val="26"/>
+        </w:rPr>
+      </w:pPr>
+    </w:p>
+    <w:p>
+      <w:pPr>
+        <w:spacing w:after="0"/>
+        <w:jc w:val="both"/>
+        <w:rPr>
+          <w:rFonts w:ascii="Arial" w:hAnsi="Arial" w:cs="Arial"/>
+          <w:sz w:val="26"/>
+          <w:szCs w:val="26"/>
+        </w:rPr>
+      </w:pPr>
+    </w:p>
+    <w:p>
+      <w:pPr>
+        <w:spacing w:after="0"/>
+        <w:jc w:val="both"/>
+        <w:rPr>
+          <w:rFonts w:ascii="Arial" w:hAnsi="Arial" w:cs="Arial"/>
+          <w:sz w:val="26"/>
+          <w:szCs w:val="26"/>
+        </w:rPr>
+      </w:pPr>
+    </w:p>
+    <w:p>
+      <w:pPr>
+        <w:spacing w:after="0"/>
+        <w:jc w:val="both"/>
+        <w:rPr>
+          <w:rFonts w:ascii="Arial" w:hAnsi="Arial" w:cs="Arial"/>
+          <w:sz w:val="26"/>
+          <w:szCs w:val="26"/>
+        </w:rPr>
+      </w:pPr>
+    </w:p>
+    <w:p>
+      <w:pPr>
+        <w:spacing w:after="0"/>
+        <w:jc w:val="both"/>
+        <w:rPr>
+          <w:rFonts w:ascii="Arial" w:hAnsi="Arial" w:cs="Arial"/>
+          <w:sz w:val="26"/>
+          <w:szCs w:val="26"/>
+        </w:rPr>
+      </w:pPr>
+    </w:p>
+    <w:p>
+      <w:pPr>
+        <w:spacing w:after="0"/>
+        <w:jc w:val="both"/>
+        <w:rPr>
+          <w:rFonts w:ascii="Arial" w:hAnsi="Arial" w:cs="Arial"/>
+          <w:sz w:val="26"/>
+          <w:szCs w:val="26"/>
+        </w:rPr>
+      </w:pPr>
+    </w:p>
+    <w:p>
+      <w:pPr>
+        <w:spacing w:after="0"/>
+        <w:jc w:val="both"/>
+        <w:rPr>
+          <w:rFonts w:ascii="Arial" w:hAnsi="Arial" w:cs="Arial"/>
           <w:sz w:val="26"/>
           <w:szCs w:val="26"/>
         </w:rPr>
@@ -2814,29 +3034,8 @@
           <w:t>adrianenriqueorozco@gmail.com</w:t>
         </w:r>
       </w:hyperlink>
-    </w:p>
-    <w:p>
-      <w:pPr>
-        <w:pStyle w:val="Prrafodelista"/>
-        <w:jc w:val="both"/>
-        <w:rPr>
-          <w:rFonts w:ascii="Arial" w:hAnsi="Arial" w:cs="Arial"/>
-          <w:b/>
-          <w:bCs/>
-          <w:sz w:val="20"/>
-          <w:szCs w:val="20"/>
-        </w:rPr>
-      </w:pPr>
-      <w:r>
-        <w:rPr>
-          <w:rFonts w:ascii="Arial" w:hAnsi="Arial" w:cs="Arial"/>
-          <w:b/>
-          <w:bCs/>
-          <w:sz w:val="20"/>
-          <w:szCs w:val="20"/>
-        </w:rPr>
-        <w:t xml:space="preserve"> </w:t>
-      </w:r>
+      <w:bookmarkStart w:id="0" w:name="_GoBack"/>
+      <w:bookmarkEnd w:id="0"/>
     </w:p>
     <w:sectPr>
       <w:headerReference w:type="default" r:id="rId9"/>

</xml_diff>

<commit_message>
docs: actualización de historial de usuarios.
</commit_message>
<xml_diff>
--- a/01-requisitos/05-historia-de-usuario/historial-de-usuario.docx
+++ b/01-requisitos/05-historia-de-usuario/historial-de-usuario.docx
@@ -1154,15 +1154,7 @@
           <w:sz w:val="26"/>
           <w:szCs w:val="26"/>
         </w:rPr>
-        <w:t>modificar</w:t>
-      </w:r>
-      <w:r>
-        <w:rPr>
-          <w:rFonts w:ascii="Arial" w:hAnsi="Arial" w:cs="Arial"/>
-          <w:sz w:val="26"/>
-          <w:szCs w:val="26"/>
-        </w:rPr>
-        <w:t xml:space="preserve"> facturas electrónicas de servicios (Impresiones, copias, transcripciones, escáner, etc.)</w:t>
+        <w:t>modificar facturas electrónicas de servicios (Impresiones, copias, transcripciones, escáner, etc.)</w:t>
       </w:r>
     </w:p>
     <w:p>
@@ -1191,23 +1183,7 @@
           <w:sz w:val="26"/>
           <w:szCs w:val="26"/>
         </w:rPr>
-        <w:t>corregir</w:t>
-      </w:r>
-      <w:r>
-        <w:rPr>
-          <w:rFonts w:ascii="Arial" w:hAnsi="Arial" w:cs="Arial"/>
-          <w:sz w:val="26"/>
-          <w:szCs w:val="26"/>
-        </w:rPr>
-        <w:t xml:space="preserve"> un historial </w:t>
-      </w:r>
-      <w:r>
-        <w:rPr>
-          <w:rFonts w:ascii="Arial" w:hAnsi="Arial" w:cs="Arial"/>
-          <w:sz w:val="26"/>
-          <w:szCs w:val="26"/>
-        </w:rPr>
-        <w:t>si me equivoqué a la hora de digitar un dato,</w:t>
+        <w:t>corregir un historial si me equivoqué a la hora de digitar un dato,</w:t>
       </w:r>
     </w:p>
     <w:p>
@@ -1317,15 +1293,7 @@
           <w:sz w:val="26"/>
           <w:szCs w:val="26"/>
         </w:rPr>
-        <w:t>eliminar</w:t>
-      </w:r>
-      <w:r>
-        <w:rPr>
-          <w:rFonts w:ascii="Arial" w:hAnsi="Arial" w:cs="Arial"/>
-          <w:sz w:val="26"/>
-          <w:szCs w:val="26"/>
-        </w:rPr>
-        <w:t xml:space="preserve"> facturas electrónicas de servicios (Impresiones, copias, transcripciones, escáner, etc.)</w:t>
+        <w:t>eliminar facturas electrónicas de servicios (Impresiones, copias, transcripciones, escáner, etc.)</w:t>
       </w:r>
     </w:p>
     <w:p>
@@ -1354,31 +1322,7 @@
           <w:sz w:val="26"/>
           <w:szCs w:val="26"/>
         </w:rPr>
-        <w:t xml:space="preserve">borrar una factura </w:t>
-      </w:r>
-      <w:r>
-        <w:rPr>
-          <w:rFonts w:ascii="Arial" w:hAnsi="Arial" w:cs="Arial"/>
-          <w:sz w:val="26"/>
-          <w:szCs w:val="26"/>
-        </w:rPr>
-        <w:t xml:space="preserve">si me </w:t>
-      </w:r>
-      <w:r>
-        <w:rPr>
-          <w:rFonts w:ascii="Arial" w:hAnsi="Arial" w:cs="Arial"/>
-          <w:sz w:val="26"/>
-          <w:szCs w:val="26"/>
-        </w:rPr>
-        <w:t>equivoque o no era necesaria</w:t>
-      </w:r>
-      <w:r>
-        <w:rPr>
-          <w:rFonts w:ascii="Arial" w:hAnsi="Arial" w:cs="Arial"/>
-          <w:sz w:val="26"/>
-          <w:szCs w:val="26"/>
-        </w:rPr>
-        <w:t>,</w:t>
+        <w:t>borrar una factura si me equivoque o no era necesaria,</w:t>
       </w:r>
     </w:p>
     <w:p>
@@ -2057,15 +2001,7 @@
           <w:sz w:val="26"/>
           <w:szCs w:val="26"/>
         </w:rPr>
-        <w:t>obtener historiales del negocio</w:t>
-      </w:r>
-      <w:r>
-        <w:rPr>
-          <w:rFonts w:ascii="Arial" w:hAnsi="Arial" w:cs="Arial"/>
-          <w:sz w:val="26"/>
-          <w:szCs w:val="26"/>
-        </w:rPr>
-        <w:t>,</w:t>
+        <w:t>obtener historiales del negocio,</w:t>
       </w:r>
     </w:p>
     <w:p>
@@ -2095,6 +2031,14 @@
           <w:szCs w:val="26"/>
         </w:rPr>
         <w:t>llevar un seguimiento</w:t>
+      </w:r>
+      <w:r>
+        <w:rPr>
+          <w:rFonts w:ascii="Arial" w:hAnsi="Arial" w:cs="Arial"/>
+          <w:sz w:val="26"/>
+          <w:szCs w:val="26"/>
+        </w:rPr>
+        <w:t>.</w:t>
       </w:r>
     </w:p>
     <w:p>
@@ -2167,6 +2111,104 @@
           <w:sz w:val="26"/>
           <w:szCs w:val="26"/>
         </w:rPr>
+        <w:t xml:space="preserve">Quiero </w:t>
+      </w:r>
+      <w:r>
+        <w:rPr>
+          <w:rFonts w:ascii="Arial" w:hAnsi="Arial" w:cs="Arial"/>
+          <w:sz w:val="26"/>
+          <w:szCs w:val="26"/>
+        </w:rPr>
+        <w:t>crear claves de acceso,</w:t>
+      </w:r>
+    </w:p>
+    <w:p>
+      <w:pPr>
+        <w:spacing w:after="0"/>
+        <w:jc w:val="both"/>
+        <w:rPr>
+          <w:rFonts w:ascii="Arial" w:hAnsi="Arial" w:cs="Arial"/>
+          <w:sz w:val="26"/>
+          <w:szCs w:val="26"/>
+        </w:rPr>
+      </w:pPr>
+      <w:r>
+        <w:rPr>
+          <w:rFonts w:ascii="Arial" w:hAnsi="Arial" w:cs="Arial"/>
+          <w:b/>
+          <w:bCs/>
+          <w:sz w:val="26"/>
+          <w:szCs w:val="26"/>
+        </w:rPr>
+        <w:t xml:space="preserve">Para </w:t>
+      </w:r>
+      <w:r>
+        <w:rPr>
+          <w:rFonts w:ascii="Arial" w:hAnsi="Arial" w:cs="Arial"/>
+          <w:sz w:val="26"/>
+          <w:szCs w:val="26"/>
+        </w:rPr>
+        <w:t>darle permisos a operadores de cibercafé para que modifiquen o eliminen facturas.</w:t>
+      </w:r>
+    </w:p>
+    <w:p>
+      <w:pPr>
+        <w:spacing w:after="0"/>
+        <w:jc w:val="both"/>
+        <w:rPr>
+          <w:rFonts w:ascii="Arial" w:hAnsi="Arial" w:cs="Arial"/>
+          <w:sz w:val="26"/>
+          <w:szCs w:val="26"/>
+        </w:rPr>
+      </w:pPr>
+    </w:p>
+    <w:p>
+      <w:pPr>
+        <w:spacing w:after="0"/>
+        <w:jc w:val="both"/>
+        <w:rPr>
+          <w:rFonts w:ascii="Arial" w:hAnsi="Arial" w:cs="Arial"/>
+          <w:sz w:val="26"/>
+          <w:szCs w:val="26"/>
+        </w:rPr>
+      </w:pPr>
+      <w:r>
+        <w:rPr>
+          <w:rFonts w:ascii="Arial" w:hAnsi="Arial" w:cs="Arial"/>
+          <w:b/>
+          <w:bCs/>
+          <w:sz w:val="26"/>
+          <w:szCs w:val="26"/>
+        </w:rPr>
+        <w:t xml:space="preserve">Como </w:t>
+      </w:r>
+      <w:r>
+        <w:rPr>
+          <w:rFonts w:ascii="Arial" w:hAnsi="Arial" w:cs="Arial"/>
+          <w:sz w:val="26"/>
+          <w:szCs w:val="26"/>
+        </w:rPr>
+        <w:t>administrador,</w:t>
+      </w:r>
+    </w:p>
+    <w:p>
+      <w:pPr>
+        <w:spacing w:after="0"/>
+        <w:jc w:val="both"/>
+        <w:rPr>
+          <w:rFonts w:ascii="Arial" w:hAnsi="Arial" w:cs="Arial"/>
+          <w:sz w:val="26"/>
+          <w:szCs w:val="26"/>
+        </w:rPr>
+      </w:pPr>
+      <w:r>
+        <w:rPr>
+          <w:rFonts w:ascii="Arial" w:hAnsi="Arial" w:cs="Arial"/>
+          <w:b/>
+          <w:bCs/>
+          <w:sz w:val="26"/>
+          <w:szCs w:val="26"/>
+        </w:rPr>
         <w:t>Quiero</w:t>
       </w:r>
       <w:r>
@@ -2254,15 +2296,7 @@
           <w:sz w:val="26"/>
           <w:szCs w:val="26"/>
         </w:rPr>
-        <w:t>administrador</w:t>
-      </w:r>
-      <w:r>
-        <w:rPr>
-          <w:rFonts w:ascii="Arial" w:hAnsi="Arial" w:cs="Arial"/>
-          <w:sz w:val="26"/>
-          <w:szCs w:val="26"/>
-        </w:rPr>
-        <w:t>,</w:t>
+        <w:t>administrador,</w:t>
       </w:r>
     </w:p>
     <w:p>
@@ -2291,15 +2325,7 @@
           <w:sz w:val="26"/>
           <w:szCs w:val="26"/>
         </w:rPr>
-        <w:t xml:space="preserve">listar, actualizar o </w:t>
-      </w:r>
-      <w:r>
-        <w:rPr>
-          <w:rFonts w:ascii="Arial" w:hAnsi="Arial" w:cs="Arial"/>
-          <w:sz w:val="26"/>
-          <w:szCs w:val="26"/>
-        </w:rPr>
-        <w:t>eliminar facturas electrónicas de servicios (Impresiones, copias, transcripciones, escáner, etc.)</w:t>
+        <w:t>listar, actualizar o eliminar facturas electrónicas de servicios (Impresiones, copias, transcripciones, escáner, etc.)</w:t>
       </w:r>
     </w:p>
     <w:p>
@@ -2328,39 +2354,7 @@
           <w:sz w:val="26"/>
           <w:szCs w:val="26"/>
         </w:rPr>
-        <w:t>manejar</w:t>
-      </w:r>
-      <w:r>
-        <w:rPr>
-          <w:rFonts w:ascii="Arial" w:hAnsi="Arial" w:cs="Arial"/>
-          <w:sz w:val="26"/>
-          <w:szCs w:val="26"/>
-        </w:rPr>
-        <w:t xml:space="preserve"> </w:t>
-      </w:r>
-      <w:r>
-        <w:rPr>
-          <w:rFonts w:ascii="Arial" w:hAnsi="Arial" w:cs="Arial"/>
-          <w:sz w:val="26"/>
-          <w:szCs w:val="26"/>
-        </w:rPr>
-        <w:t>las</w:t>
-      </w:r>
-      <w:r>
-        <w:rPr>
-          <w:rFonts w:ascii="Arial" w:hAnsi="Arial" w:cs="Arial"/>
-          <w:sz w:val="26"/>
-          <w:szCs w:val="26"/>
-        </w:rPr>
-        <w:t xml:space="preserve"> factura</w:t>
-      </w:r>
-      <w:r>
-        <w:rPr>
-          <w:rFonts w:ascii="Arial" w:hAnsi="Arial" w:cs="Arial"/>
-          <w:sz w:val="26"/>
-          <w:szCs w:val="26"/>
-        </w:rPr>
-        <w:t>s.</w:t>
+        <w:t>manejar las facturas.</w:t>
       </w:r>
     </w:p>
     <w:p>
@@ -2772,61 +2766,8 @@
           <w:szCs w:val="26"/>
         </w:rPr>
       </w:pPr>
-    </w:p>
-    <w:p>
-      <w:pPr>
-        <w:spacing w:after="0"/>
-        <w:jc w:val="both"/>
-        <w:rPr>
-          <w:rFonts w:ascii="Arial" w:hAnsi="Arial" w:cs="Arial"/>
-          <w:sz w:val="26"/>
-          <w:szCs w:val="26"/>
-        </w:rPr>
-      </w:pPr>
-    </w:p>
-    <w:p>
-      <w:pPr>
-        <w:spacing w:after="0"/>
-        <w:jc w:val="both"/>
-        <w:rPr>
-          <w:rFonts w:ascii="Arial" w:hAnsi="Arial" w:cs="Arial"/>
-          <w:sz w:val="26"/>
-          <w:szCs w:val="26"/>
-        </w:rPr>
-      </w:pPr>
-    </w:p>
-    <w:p>
-      <w:pPr>
-        <w:spacing w:after="0"/>
-        <w:jc w:val="both"/>
-        <w:rPr>
-          <w:rFonts w:ascii="Arial" w:hAnsi="Arial" w:cs="Arial"/>
-          <w:sz w:val="26"/>
-          <w:szCs w:val="26"/>
-        </w:rPr>
-      </w:pPr>
-    </w:p>
-    <w:p>
-      <w:pPr>
-        <w:spacing w:after="0"/>
-        <w:jc w:val="both"/>
-        <w:rPr>
-          <w:rFonts w:ascii="Arial" w:hAnsi="Arial" w:cs="Arial"/>
-          <w:sz w:val="26"/>
-          <w:szCs w:val="26"/>
-        </w:rPr>
-      </w:pPr>
-    </w:p>
-    <w:p>
-      <w:pPr>
-        <w:spacing w:after="0"/>
-        <w:jc w:val="both"/>
-        <w:rPr>
-          <w:rFonts w:ascii="Arial" w:hAnsi="Arial" w:cs="Arial"/>
-          <w:sz w:val="26"/>
-          <w:szCs w:val="26"/>
-        </w:rPr>
-      </w:pPr>
+      <w:bookmarkStart w:id="0" w:name="_GoBack"/>
+      <w:bookmarkEnd w:id="0"/>
     </w:p>
     <w:p>
       <w:pPr>
@@ -3034,8 +2975,6 @@
           <w:t>adrianenriqueorozco@gmail.com</w:t>
         </w:r>
       </w:hyperlink>
-      <w:bookmarkStart w:id="0" w:name="_GoBack"/>
-      <w:bookmarkEnd w:id="0"/>
     </w:p>
     <w:sectPr>
       <w:headerReference w:type="default" r:id="rId9"/>

</xml_diff>